<commit_message>
restructured the introduction to the BHD chapter. Began organising the start of the phase noise requirement section
</commit_message>
<xml_diff>
--- a/BHD for LIGO structure.docx
+++ b/BHD for LIGO structure.docx
@@ -18,11 +18,15 @@
     <w:p>
       <w:pPr>
         <w:rPr>
+          <w:b/>
+          <w:bCs/>
           <w:u w:val="single"/>
         </w:rPr>
       </w:pPr>
       <w:r>
         <w:rPr>
+          <w:b/>
+          <w:bCs/>
           <w:u w:val="single"/>
         </w:rPr>
         <w:t>Intro</w:t>
@@ -56,11 +60,15 @@
     <w:p>
       <w:pPr>
         <w:rPr>
+          <w:b/>
+          <w:bCs/>
           <w:u w:val="single"/>
         </w:rPr>
       </w:pPr>
       <w:r>
         <w:rPr>
+          <w:b/>
+          <w:bCs/>
           <w:u w:val="single"/>
         </w:rPr>
         <w:t>BHD versus DC readout for A+</w:t>
@@ -73,7 +81,79 @@
     </w:p>
     <w:p>
       <w:r>
-        <w:t xml:space="preserve">Different gravitational wave signals carry their information in different frequency bands, and the detector may be optimised to </w:t>
+        <w:t>The current detection scheme is known as DC readout.</w:t>
+      </w:r>
+    </w:p>
+    <w:p>
+      <w:proofErr w:type="gramStart"/>
+      <w:r>
+        <w:t>In order for</w:t>
+      </w:r>
+      <w:proofErr w:type="gramEnd"/>
+      <w:r>
+        <w:t xml:space="preserve"> BHD to be worthwhile, it must be at least as good as DC readout.</w:t>
+      </w:r>
+    </w:p>
+    <w:p>
+      <w:r>
+        <w:t>BHD has some practical benefits over DC readout as well as some interesting prospects in relation to the quantum noise limit of the detector</w:t>
+      </w:r>
+      <w:r>
+        <w:t>.</w:t>
+      </w:r>
+    </w:p>
+    <w:p>
+      <w:r>
+        <w:t>One of the practical outcomes of implementing BHD is the potential to reduce SRC length noise coupling.</w:t>
+      </w:r>
+    </w:p>
+    <w:p>
+      <w:r>
+        <w:t>The dominant coupling due to the power entering the SRC can be intuitively understood by considering a Fabry-Perot cavity.</w:t>
+      </w:r>
+    </w:p>
+    <w:p>
+      <w:r>
+        <w:t xml:space="preserve">The second route that SRC length noise may couple to the </w:t>
+      </w:r>
+      <w:proofErr w:type="spellStart"/>
+      <w:r>
+        <w:t>the</w:t>
+      </w:r>
+      <w:proofErr w:type="spellEnd"/>
+      <w:r>
+        <w:t xml:space="preserve"> signal is by the optomechanical coupling due to </w:t>
+      </w:r>
+      <w:proofErr w:type="gramStart"/>
+      <w:r>
+        <w:t>an the</w:t>
+      </w:r>
+      <w:proofErr w:type="gramEnd"/>
+      <w:r>
+        <w:t xml:space="preserve"> optical springs between the SRC and the arm cavity.</w:t>
+      </w:r>
+    </w:p>
+    <w:p>
+      <w:r>
+        <w:t>SRC length noise is currently too high for LIGO to meet the A+ requirements \href{</w:t>
+      </w:r>
+      <w:proofErr w:type="gramStart"/>
+      <w:r>
+        <w:t>https://alog.ligo-wa.caltech.edu/aLOG/index.php?callRep=55755}{</w:t>
+      </w:r>
+      <w:proofErr w:type="gramEnd"/>
+      <w:r>
+        <w:t>Shelia Dwyer post}.</w:t>
+      </w:r>
+    </w:p>
+    <w:p>
+      <w:r>
+        <w:t>Strictly speaking these are not properties of BHD readout, as the reduction of scatter from the septum window and the SRC length noise reduction could be achieved by other means.</w:t>
+      </w:r>
+    </w:p>
+    <w:p>
+      <w:r>
+        <w:t xml:space="preserve">Different gravitational wave sources carry their information in different frequency bands, and the detector may be optimised to </w:t>
       </w:r>
       <w:proofErr w:type="spellStart"/>
       <w:r>
@@ -86,32 +166,128 @@
     </w:p>
     <w:p>
       <w:r>
-        <w:t>In addition to being key in shaping the noise curve of the detector, BHD has some practical benefits over DC readout.</w:t>
-      </w:r>
-    </w:p>
-    <w:p>
-      <w:r>
-        <w:t>DC readout produces a field due to a constant differential offset in the arm lengths.</w:t>
-      </w:r>
-    </w:p>
-    <w:p>
-      <w:r>
-        <w:t>As the BHD signal is obtained through subtracting the signals from two photodiodes, it is possible to obtain a very low electronic noise floor when designing the transimpedance amplifier by subtracting the currents produced by the photo-diodes rather than having two separate transimpedance amplifiers and subtracting the signals made by these later.</w:t>
-      </w:r>
-    </w:p>
-    <w:p>
-      <w:r>
-        <w:t>One of the practical outcomes of implementing BHD is the potential to reduce SRC length noise coupling.</w:t>
-      </w:r>
-    </w:p>
-    <w:p>
-      <w:r>
-        <w:t>The dominant coupling due to the power entering the SRC can be intuitively understood by considering a Fabry-Perot cavity.</w:t>
-      </w:r>
-    </w:p>
-    <w:p>
-      <w:r>
-        <w:t xml:space="preserve">The second route that SRC length noise may couple to the </w:t>
+        <w:t xml:space="preserve">The current generation of gravitational wave detectors are going to be limited by a combination of </w:t>
+      </w:r>
+      <w:proofErr w:type="spellStart"/>
+      <w:r>
+        <w:t>of</w:t>
+      </w:r>
+      <w:proofErr w:type="spellEnd"/>
+      <w:r>
+        <w:t xml:space="preserve"> radiation pressure noise and shot noise in their detection bands.</w:t>
+      </w:r>
+    </w:p>
+    <w:p>
+      <w:r>
+        <w:t xml:space="preserve">A squeezed light field can be used to surpass the noise floor set by </w:t>
+      </w:r>
+      <w:proofErr w:type="gramStart"/>
+      <w:r>
+        <w:t>an</w:t>
+      </w:r>
+      <w:proofErr w:type="gramEnd"/>
+      <w:r>
+        <w:t xml:space="preserve"> squeezed state.</w:t>
+      </w:r>
+    </w:p>
+    <w:p>
+      <w:r>
+        <w:t>More advanced upgrades, e.g. see \</w:t>
+      </w:r>
+      <w:proofErr w:type="gramStart"/>
+      <w:r>
+        <w:t>cite{</w:t>
+      </w:r>
+      <w:proofErr w:type="gramEnd"/>
+      <w:r>
+        <w:t>Kimble2001}, could reduce quantum noise substantially, and they rely on the implementation of BHD.</w:t>
+      </w:r>
+    </w:p>
+    <w:p>
+      <w:r>
+        <w:t>In summary, BHD has a couple of key advantages over DC readout, namely the reduction in SRCL noise coupling and the ability to shape the quantum noise floor of the interferometer in conjunction with other upgrades.</w:t>
+      </w:r>
+    </w:p>
+    <w:p>
+      <w:pPr>
+        <w:rPr>
+          <w:b/>
+          <w:bCs/>
+          <w:u w:val="single"/>
+        </w:rPr>
+      </w:pPr>
+      <w:r>
+        <w:rPr>
+          <w:b/>
+          <w:bCs/>
+          <w:u w:val="single"/>
+        </w:rPr>
+        <w:lastRenderedPageBreak/>
+        <w:t>Local Oscillator Path Length Stability Requirement</w:t>
+      </w:r>
+    </w:p>
+    <w:p>
+      <w:r>
+        <w:t>This section will go through the steps required to derive the phase noise requirement for the beam path of the A+ LO.</w:t>
+      </w:r>
+    </w:p>
+    <w:p>
+      <w:r>
+        <w:t>Phase noise arises due to phase fluctuations in the LO beam being indistinguishable is phase fluctuations in the AS beam</w:t>
+      </w:r>
+      <w:r>
+        <w:t>.</w:t>
+      </w:r>
+    </w:p>
+    <w:p>
+      <w:r>
+        <w:t>The relationship between the differential phase in the arms and the power in the signal beam was used to find a light noise curve</w:t>
+      </w:r>
+      <w:r>
+        <w:t>.</w:t>
+      </w:r>
+    </w:p>
+    <w:p>
+      <w:r>
+        <w:t>This light noise curve was then used to set the maximum allowable intensity fluctuations due to phase noise between the local oscillator and the signal beams.</w:t>
+      </w:r>
+    </w:p>
+    <w:p/>
+    <w:p>
+      <w:r>
+        <w:t>\</w:t>
+      </w:r>
+      <w:proofErr w:type="gramStart"/>
+      <w:r>
+        <w:t>subsection{</w:t>
+      </w:r>
+      <w:proofErr w:type="gramEnd"/>
+      <w:r>
+        <w:rPr>
+          <w:u w:val="single"/>
+        </w:rPr>
+        <w:t>Local Oscillator Path</w:t>
+      </w:r>
+      <w:r>
+        <w:t>}</w:t>
+      </w:r>
+    </w:p>
+    <w:p>
+      <w:r>
+        <w:t>Two options for the local oscillator path were considered: a beam picked off from the main beam splitters AR coating (BSAR) or the beam transmitted through PR2 \</w:t>
+      </w:r>
+      <w:proofErr w:type="gramStart"/>
+      <w:r>
+        <w:t>cite{</w:t>
+      </w:r>
+      <w:proofErr w:type="gramEnd"/>
+      <w:r>
+        <w:t>Zhang2019} (POP).</w:t>
+      </w:r>
+    </w:p>
+    <w:p>
+      <w:r>
+        <w:t xml:space="preserve">The layout for the optics which combine the </w:t>
       </w:r>
       <w:proofErr w:type="spellStart"/>
       <w:r>
@@ -119,31 +295,646 @@
       </w:r>
       <w:proofErr w:type="spellEnd"/>
       <w:r>
-        <w:t xml:space="preserve"> signal is by the optomechanical coupling due to </w:t>
-      </w:r>
-      <w:proofErr w:type="gramStart"/>
-      <w:r>
-        <w:t>an the</w:t>
-      </w:r>
-      <w:proofErr w:type="gramEnd"/>
-      <w:r>
-        <w:t xml:space="preserve"> optical springs between the SRC and the arm cavity.</w:t>
-      </w:r>
-    </w:p>
-    <w:p>
-      <w:r>
-        <w:t>SRC length noise is currently too high for LIGO to meet the A+ requirements \href{</w:t>
-      </w:r>
-      <w:proofErr w:type="gramStart"/>
-      <w:r>
-        <w:t>https://alog.ligo-wa.caltech.edu/aLOG/index.php?callRep=55755}{</w:t>
-      </w:r>
-      <w:proofErr w:type="gramEnd"/>
-      <w:r>
-        <w:t>Shelia Dwyer post}</w:t>
-      </w:r>
-    </w:p>
-    <w:p/>
+        <w:t xml:space="preserve"> LO and AS beam is shown in figure \ref{</w:t>
+      </w:r>
+      <w:proofErr w:type="spellStart"/>
+      <w:proofErr w:type="gramStart"/>
+      <w:r>
+        <w:t>fig:bhdforligochaptersketchoflodelivery</w:t>
+      </w:r>
+      <w:proofErr w:type="spellEnd"/>
+      <w:proofErr w:type="gramEnd"/>
+      <w:r>
+        <w:t>}</w:t>
+      </w:r>
+    </w:p>
+    <w:p>
+      <w:r>
+        <w:t>\</w:t>
+      </w:r>
+      <w:proofErr w:type="gramStart"/>
+      <w:r>
+        <w:t>subsection{</w:t>
+      </w:r>
+      <w:proofErr w:type="gramEnd"/>
+      <w:r>
+        <w:t>The Linear Response Function Between Differential Strain and Power at the AS Port}</w:t>
+      </w:r>
+    </w:p>
+    <w:p>
+      <w:r>
+        <w:t>The linear response function of the A+ detectors was obtained using \</w:t>
+      </w:r>
+      <w:proofErr w:type="spellStart"/>
+      <w:proofErr w:type="gramStart"/>
+      <w:r>
+        <w:t>textsc</w:t>
+      </w:r>
+      <w:proofErr w:type="spellEnd"/>
+      <w:r>
+        <w:t>{</w:t>
+      </w:r>
+      <w:proofErr w:type="gramEnd"/>
+      <w:r>
+        <w:t>Finesse}.</w:t>
+      </w:r>
+    </w:p>
+    <w:p>
+      <w:r>
+        <w:t>\</w:t>
+      </w:r>
+      <w:proofErr w:type="gramStart"/>
+      <w:r>
+        <w:t>subsection{</w:t>
+      </w:r>
+      <w:proofErr w:type="gramEnd"/>
+      <w:r>
+        <w:t>Converting the Sensitivity Curve for A+ into the HRTS requirement}</w:t>
+      </w:r>
+    </w:p>
+    <w:p>
+      <w:r>
+        <w:t>To convert the A+ sensitivity curve into a path length stability requirement for the local oscillator, a few steps are required</w:t>
+      </w:r>
+      <w:r>
+        <w:t>.</w:t>
+      </w:r>
+    </w:p>
+    <w:p>
+      <w:r>
+        <w:t>The A+ sensitivity\cite{</w:t>
+      </w:r>
+      <w:proofErr w:type="spellStart"/>
+      <w:r>
+        <w:t>a+curve</w:t>
+      </w:r>
+      <w:proofErr w:type="spellEnd"/>
+      <w:r>
+        <w:t>} curve was multiplied by the function shown in \ref{</w:t>
+      </w:r>
+      <w:proofErr w:type="spellStart"/>
+      <w:r>
+        <w:t>fig:bhdforligochapterdetectorrepsonse</w:t>
+      </w:r>
+      <w:proofErr w:type="spellEnd"/>
+      <w:r>
+        <w:t>} to convert it from units of $\frac{\rm{h}}{\sqrt{\rm{Hz}}}$ to $\frac{\rm{W}}{\sqrt{\rm{Hz}}}$</w:t>
+      </w:r>
+    </w:p>
+    <w:p>
+      <w:r>
+        <w:t>The quantum mechanics of this problem have been included in the A+ sensitivity curve \cite{</w:t>
+      </w:r>
+      <w:proofErr w:type="spellStart"/>
+      <w:r>
+        <w:t>a+curve</w:t>
+      </w:r>
+      <w:proofErr w:type="spellEnd"/>
+      <w:r>
+        <w:t>}, therefore we can approach this with classical physics</w:t>
+      </w:r>
+    </w:p>
+    <w:p>
+      <w:r>
+        <w:t>The HRTS requirement assumes, based on the current design, that there will be 2 mirrors at 45\</w:t>
+      </w:r>
+      <w:proofErr w:type="spellStart"/>
+      <w:r>
+        <w:t>si</w:t>
+      </w:r>
+      <w:proofErr w:type="spellEnd"/>
+      <w:r>
+        <w:t>{\</w:t>
+      </w:r>
+      <w:proofErr w:type="gramStart"/>
+      <w:r>
+        <w:t>degree}  which</w:t>
+      </w:r>
+      <w:proofErr w:type="gramEnd"/>
+      <w:r>
+        <w:t xml:space="preserve"> are used to steer the AS and LO beams.</w:t>
+      </w:r>
+    </w:p>
+    <w:p>
+      <w:pPr>
+        <w:rPr>
+          <w:b/>
+          <w:bCs/>
+        </w:rPr>
+      </w:pPr>
+      <w:r>
+        <w:rPr>
+          <w:b/>
+          <w:bCs/>
+        </w:rPr>
+        <w:t>Design of the HAM6 layout</w:t>
+      </w:r>
+    </w:p>
+    <w:p>
+      <w:r>
+        <w:t xml:space="preserve">Fundamentally, the layout in HAM6 must combine the AS beam and the LO </w:t>
+      </w:r>
+      <w:proofErr w:type="gramStart"/>
+      <w:r>
+        <w:t>beam, and</w:t>
+      </w:r>
+      <w:proofErr w:type="gramEnd"/>
+      <w:r>
+        <w:t xml:space="preserve"> sense the combined beams to form a balanced homodyne detector.</w:t>
+      </w:r>
+    </w:p>
+    <w:p>
+      <w:r>
+        <w:t>\</w:t>
+      </w:r>
+      <w:proofErr w:type="gramStart"/>
+      <w:r>
+        <w:t>subsection{</w:t>
+      </w:r>
+      <w:proofErr w:type="gramEnd"/>
+      <w:r>
+        <w:t>The Constraints and Requirements of the Layout of HAM6}</w:t>
+      </w:r>
+    </w:p>
+    <w:p>
+      <w:r>
+        <w:t>The entry point of the AS and LO beams in principle can be anywhere in HAM6, however in reality they are fixed due to the location of HAM6 with respect to the interferometer, due to the location of the septum windows between HAM5 and HAM6, and due to the many other components of the interferometer that these beams need to avoid.</w:t>
+      </w:r>
+    </w:p>
+    <w:p>
+      <w:r>
+        <w:t>The design beam parameter at the SRM is $q_{\</w:t>
+      </w:r>
+      <w:proofErr w:type="gramStart"/>
+      <w:r>
+        <w:t>rm{</w:t>
+      </w:r>
+      <w:proofErr w:type="gramEnd"/>
+      <w:r>
+        <w:t>SRM}} = -3.55 + 1.09i\,\rm{m} $, so the design of the HAM6 mode matching optics is based on this number.</w:t>
+      </w:r>
+    </w:p>
+    <w:p>
+      <w:r>
+        <w:lastRenderedPageBreak/>
+        <w:t xml:space="preserve">After BHDBS2, the layout the optics between OMC input couplers and BHDBS2 must provide the functionality for steering the combined AS and LO beam into the </w:t>
+      </w:r>
+      <w:proofErr w:type="gramStart"/>
+      <w:r>
+        <w:t>OMC, and</w:t>
+      </w:r>
+      <w:proofErr w:type="gramEnd"/>
+      <w:r>
+        <w:t xml:space="preserve"> provide mode matching for the AS beam to the OMC.</w:t>
+      </w:r>
+    </w:p>
+    <w:p>
+      <w:r>
+        <w:t>After the AS and LO beams are combined, double stage suspensions will guide the beam from BHDBS2 to the OMC. These suspensions provide active positioning control and active wave front control.</w:t>
+      </w:r>
+    </w:p>
+    <w:p>
+      <w:r>
+        <w:t>To provide orthogonal alignment control in each beam path after BHDBS2, two of the mirrors are required to be separated by $90\</w:t>
+      </w:r>
+      <w:proofErr w:type="spellStart"/>
+      <w:r>
+        <w:t>si</w:t>
+      </w:r>
+      <w:proofErr w:type="spellEnd"/>
+      <w:r>
+        <w:t>{\</w:t>
+      </w:r>
+      <w:proofErr w:type="gramStart"/>
+      <w:r>
+        <w:t>degree}$</w:t>
+      </w:r>
+      <w:proofErr w:type="gramEnd"/>
+      <w:r>
+        <w:t xml:space="preserve"> of </w:t>
+      </w:r>
+      <w:proofErr w:type="spellStart"/>
+      <w:r>
+        <w:t>Gouy</w:t>
+      </w:r>
+      <w:proofErr w:type="spellEnd"/>
+      <w:r>
+        <w:t xml:space="preserve"> phase.</w:t>
+      </w:r>
+    </w:p>
+    <w:p>
+      <w:r>
+        <w:t xml:space="preserve">The goal for mode matching between the arm mode and the OMC mode is </w:t>
+      </w:r>
+      <w:proofErr w:type="spellStart"/>
+      <w:r>
+        <w:t>is</w:t>
+      </w:r>
+      <w:proofErr w:type="spellEnd"/>
+      <w:r>
+        <w:t xml:space="preserve"> $&gt;98\%$.</w:t>
+      </w:r>
+    </w:p>
+    <w:p>
+      <w:r>
+        <w:t xml:space="preserve">The current OMC design (with trivial modifications) will be used to remove junk light from the signal beam, so </w:t>
+      </w:r>
+      <w:proofErr w:type="spellStart"/>
+      <w:proofErr w:type="gramStart"/>
+      <w:r>
+        <w:t>their</w:t>
+      </w:r>
+      <w:proofErr w:type="spellEnd"/>
+      <w:proofErr w:type="gramEnd"/>
+      <w:r>
+        <w:t xml:space="preserve"> is no choice in target waist size.</w:t>
+      </w:r>
+    </w:p>
+    <w:p>
+      <w:r>
+        <w:t>The light transmitted by the OMCs is used to measure the gravitational wave signal, since the higher order modes are suppressed by a factor of the finesse of the OMC.</w:t>
+      </w:r>
+    </w:p>
+    <w:p>
+      <w:r>
+        <w:t>It was decided that the two beams after BHDBS2 would have the same path length to reduce the cost of the HAM6 optics. This may also improve the common-mode noise rejection ratio.</w:t>
+      </w:r>
+    </w:p>
+    <w:p>
+      <w:r>
+        <w:t>\</w:t>
+      </w:r>
+      <w:proofErr w:type="gramStart"/>
+      <w:r>
+        <w:t>subsection{</w:t>
+      </w:r>
+      <w:proofErr w:type="gramEnd"/>
+      <w:r>
+        <w:t>Longitudinal Control}</w:t>
+      </w:r>
+    </w:p>
+    <w:p>
+      <w:r>
+        <w:t>Longitudinal control refers to the sensing and actuation of lengths within the interferometer, i.e.</w:t>
+      </w:r>
+      <w:proofErr w:type="gramStart"/>
+      <w:r>
+        <w:t>\,position</w:t>
+      </w:r>
+      <w:proofErr w:type="gramEnd"/>
+      <w:r>
+        <w:t xml:space="preserve"> of optics along the optical axis.</w:t>
+      </w:r>
+    </w:p>
+    <w:p>
+      <w:r>
+        <w:t>\</w:t>
+      </w:r>
+      <w:proofErr w:type="gramStart"/>
+      <w:r>
+        <w:t>subsubsection{</w:t>
+      </w:r>
+      <w:proofErr w:type="gramEnd"/>
+      <w:r>
+        <w:t>Homodyne Angle}</w:t>
+      </w:r>
+    </w:p>
+    <w:p>
+      <w:r>
+        <w:t>One method of controlling the homodyne angle is using the so called `RF 36` signal.</w:t>
+      </w:r>
+    </w:p>
+    <w:p>
+      <w:r>
+        <w:t>\</w:t>
+      </w:r>
+      <w:proofErr w:type="gramStart"/>
+      <w:r>
+        <w:t>subsubsection{</w:t>
+      </w:r>
+      <w:proofErr w:type="gramEnd"/>
+      <w:r>
+        <w:t>OMC Length}</w:t>
+      </w:r>
+    </w:p>
+    <w:p>
+      <w:r>
+        <w:t>Keeping the OMC length locked to the combined LO-AS beam can be done by actuating on the length of PZT mirrors in the OMC.</w:t>
+      </w:r>
+    </w:p>
+    <w:p>
+      <w:r>
+        <w:t>\</w:t>
+      </w:r>
+      <w:proofErr w:type="gramStart"/>
+      <w:r>
+        <w:t>subsubsection{</w:t>
+      </w:r>
+      <w:proofErr w:type="gramEnd"/>
+      <w:r>
+        <w:t>Squeezing Angle to Measurement Phase}</w:t>
+      </w:r>
+    </w:p>
+    <w:p>
+      <w:r>
+        <w:t xml:space="preserve">The squeezing and measurement phase may be controlled by measuring the </w:t>
+      </w:r>
+      <w:proofErr w:type="gramStart"/>
+      <w:r>
+        <w:t>3,MHz</w:t>
+      </w:r>
+      <w:proofErr w:type="gramEnd"/>
+      <w:r>
+        <w:t xml:space="preserve"> signal transmitted through the OMC.</w:t>
+      </w:r>
+    </w:p>
+    <w:p>
+      <w:r>
+        <w:t>\</w:t>
+      </w:r>
+      <w:proofErr w:type="gramStart"/>
+      <w:r>
+        <w:t>subsection{</w:t>
+      </w:r>
+      <w:proofErr w:type="gramEnd"/>
+      <w:r>
+        <w:t>Alignment Control}</w:t>
+      </w:r>
+    </w:p>
+    <w:p>
+      <w:r>
+        <w:t>The alignment of beams within the interferometer is required to maximise the power of the laser the mode containing the gravitational wave signal.</w:t>
+      </w:r>
+    </w:p>
+    <w:p>
+      <w:r>
+        <w:t>\</w:t>
+      </w:r>
+      <w:proofErr w:type="gramStart"/>
+      <w:r>
+        <w:t>subsubsection{</w:t>
+      </w:r>
+      <w:proofErr w:type="gramEnd"/>
+      <w:r>
+        <w:t>LO and AS alignment}</w:t>
+      </w:r>
+    </w:p>
+    <w:p>
+      <w:r>
+        <w:t>The alignment of the signal to the to the AS beam will be done with either OM0 or BHDM1, and BHDBS2.</w:t>
+      </w:r>
+    </w:p>
+    <w:p>
+      <w:r>
+        <w:t>\</w:t>
+      </w:r>
+      <w:proofErr w:type="gramStart"/>
+      <w:r>
+        <w:t>subsubsection{</w:t>
+      </w:r>
+      <w:proofErr w:type="gramEnd"/>
+      <w:r>
+        <w:t>Alignment of the LO-AS beam to the OMC}</w:t>
+      </w:r>
+    </w:p>
+    <w:p>
+      <w:r>
+        <w:t>A dither applied to a HRTS in either the LO or AS path will produce a signal in transmission through the OMC.</w:t>
+      </w:r>
+    </w:p>
+    <w:p>
+      <w:r>
+        <w:t>\</w:t>
+      </w:r>
+      <w:proofErr w:type="gramStart"/>
+      <w:r>
+        <w:t>subsubsection{</w:t>
+      </w:r>
+      <w:proofErr w:type="gramEnd"/>
+      <w:r>
+        <w:t>Squeezer to AS beam}</w:t>
+      </w:r>
+    </w:p>
+    <w:p>
+      <w:r>
+        <w:lastRenderedPageBreak/>
+        <w:t>The pick-off at OM0 will be used to align the squeezer beam to the AS beam.</w:t>
+      </w:r>
+    </w:p>
+    <w:p>
+      <w:r>
+        <w:t>\</w:t>
+      </w:r>
+      <w:proofErr w:type="gramStart"/>
+      <w:r>
+        <w:t>subsubsection{</w:t>
+      </w:r>
+      <w:proofErr w:type="gramEnd"/>
+      <w:r>
+        <w:t>Differential Hard Mode}</w:t>
+      </w:r>
+    </w:p>
+    <w:p>
+      <w:r>
+        <w:t>The differential hard mode arises due to radiation pressure effects in the arm cavities.</w:t>
+      </w:r>
+    </w:p>
+    <w:p>
+      <w:r>
+        <w:t>\</w:t>
+      </w:r>
+      <w:proofErr w:type="gramStart"/>
+      <w:r>
+        <w:t>subsection{</w:t>
+      </w:r>
+      <w:proofErr w:type="gramEnd"/>
+      <w:r>
+        <w:t>Chosen Layout}</w:t>
+      </w:r>
+    </w:p>
+    <w:p>
+      <w:r>
+        <w:t>Optically, there are many layouts which could have satisfied the above requirements and constraints.</w:t>
+      </w:r>
+    </w:p>
+    <w:p>
+      <w:r>
+        <w:t>The focal lengths of the OFI lens, OMx1 and OMx2 where optimised so that there was a close to $45\</w:t>
+      </w:r>
+      <w:proofErr w:type="spellStart"/>
+      <w:r>
+        <w:t>si</w:t>
+      </w:r>
+      <w:proofErr w:type="spellEnd"/>
+      <w:r>
+        <w:t>{\</w:t>
+      </w:r>
+      <w:proofErr w:type="gramStart"/>
+      <w:r>
+        <w:t>degree}$</w:t>
+      </w:r>
+      <w:proofErr w:type="gramEnd"/>
+      <w:r>
+        <w:t xml:space="preserve"> </w:t>
+      </w:r>
+      <w:proofErr w:type="spellStart"/>
+      <w:r>
+        <w:t>Gouy</w:t>
+      </w:r>
+      <w:proofErr w:type="spellEnd"/>
+      <w:r>
+        <w:t xml:space="preserve"> phase separation between OMx1 and OMx2 as </w:t>
+      </w:r>
+      <w:proofErr w:type="spellStart"/>
+      <w:r>
+        <w:t>possilbe</w:t>
+      </w:r>
+      <w:proofErr w:type="spellEnd"/>
+      <w:r>
+        <w:t>.</w:t>
+      </w:r>
+    </w:p>
+    <w:p>
+      <w:pPr>
+        <w:rPr>
+          <w:b/>
+          <w:bCs/>
+        </w:rPr>
+      </w:pPr>
+      <w:r>
+        <w:rPr>
+          <w:b/>
+          <w:bCs/>
+        </w:rPr>
+        <w:t xml:space="preserve">WS </w:t>
+      </w:r>
+      <w:proofErr w:type="spellStart"/>
+      <w:r>
+        <w:rPr>
+          <w:b/>
+          <w:bCs/>
+        </w:rPr>
+        <w:t>visulations</w:t>
+      </w:r>
+      <w:proofErr w:type="spellEnd"/>
+      <w:r>
+        <w:rPr>
+          <w:b/>
+          <w:bCs/>
+        </w:rPr>
+        <w:t xml:space="preserve"> for Analysing the Robustness of the HAM6 Layout to Mode-Mismatch</w:t>
+      </w:r>
+    </w:p>
+    <w:p>
+      <w:r>
+        <w:t>The mode-matching between two laser beam modes, or a laser mode and a cavity mode, describes how similar those two modes are.</w:t>
+      </w:r>
+    </w:p>
+    <w:p>
+      <w:r>
+        <w:t>Mode-matching is usually, to first approximation, thought of as a difference in beam waist size and beam size location.</w:t>
+      </w:r>
+    </w:p>
+    <w:p>
+      <w:r>
+        <w:t>A curved mirror can only change the curvature of a Gaussian beam, meaning that at the mirrors surface the beams before and after reflection must have the same size.</w:t>
+      </w:r>
+    </w:p>
+    <w:p>
+      <w:r>
+        <w:t>To visualise how a mode is changed by an optical layout, beam parameters can be represented in a 'WS space'.</w:t>
+      </w:r>
+    </w:p>
+    <w:p>
+      <w:r>
+        <w:t>To demonstrate how orthogonal actuators can be represented in WS space, consider the two lenses with variable power separated by 45\</w:t>
+      </w:r>
+      <w:proofErr w:type="spellStart"/>
+      <w:r>
+        <w:t>si</w:t>
+      </w:r>
+      <w:proofErr w:type="spellEnd"/>
+      <w:r>
+        <w:t xml:space="preserve">{\degree} of </w:t>
+      </w:r>
+      <w:proofErr w:type="spellStart"/>
+      <w:r>
+        <w:t>Gouy</w:t>
+      </w:r>
+      <w:proofErr w:type="spellEnd"/>
+      <w:r>
+        <w:t xml:space="preserve"> phase.</w:t>
+      </w:r>
+    </w:p>
+    <w:p>
+      <w:r>
+        <w:t>Two perfectly mode matched beams will have identical beam parameters.</w:t>
+      </w:r>
+    </w:p>
+    <w:p>
+      <w:r>
+        <w:t>The mode matching requirement for LIGO is $&gt;98\%$.</w:t>
+      </w:r>
+    </w:p>
+    <w:p>
+      <w:r>
+        <w:t>The modes from the SRM that can be matched at to the target is shown in Figure \ref{</w:t>
+      </w:r>
+      <w:proofErr w:type="gramStart"/>
+      <w:r>
+        <w:t>fig:bhdforligochapterlayout</w:t>
+      </w:r>
+      <w:proofErr w:type="gramEnd"/>
+      <w:r>
+        <w:t>5fmodessrmomcmodematchingsuccess}.</w:t>
+      </w:r>
+    </w:p>
+    <w:p>
+      <w:r>
+        <w:t>Nevertheless, Figure \ref{fig:bhdforligochapterlayout5fmodessrmomcmodematchingsuccess} is encouraging since it shows that the actuation provided by the OMx1 and OMx2 is very forgiving, so much so that the strict definition of the role of AWC in HAM6 may be relaxed in order for operators to use the AWC here to correct for other errors in the geometry of LIGO.</w:t>
+      </w:r>
+    </w:p>
+    <w:p>
+      <w:r>
+        <w:t>\</w:t>
+      </w:r>
+      <w:proofErr w:type="gramStart"/>
+      <w:r>
+        <w:t>section{</w:t>
+      </w:r>
+      <w:proofErr w:type="gramEnd"/>
+      <w:r>
+        <w:t>Conclusion about BHD for A+}</w:t>
+      </w:r>
+    </w:p>
+    <w:p>
+      <w:r>
+        <w:t>One of the major changes to LIGO for A+ will be the implementation of BHD.</w:t>
+      </w:r>
+    </w:p>
+    <w:p>
+      <w:r>
+        <w:t>BHD presents some technical challenges over DC readout.</w:t>
+      </w:r>
+    </w:p>
+    <w:p>
+      <w:r>
+        <w:t>The functionality required from the BHD layout was discussed, and a proposed layout that satisfies these requirements is shown in figure \ref{</w:t>
+      </w:r>
+      <w:proofErr w:type="gramStart"/>
+      <w:r>
+        <w:t>fig:bhdforligochapterlayout</w:t>
+      </w:r>
+      <w:proofErr w:type="gramEnd"/>
+      <w:r>
+        <w:t>5f}.</w:t>
+      </w:r>
+    </w:p>
+    <w:p>
+      <w:r>
+        <w:t>By plotting the $&lt;98\%$ mode matching requirement in WS space, the robustness to changes in the input beam parameter was investigated.</w:t>
+      </w:r>
+    </w:p>
     <w:sectPr>
       <w:pgSz w:w="11906" w:h="16838"/>
       <w:pgMar w:top="1440" w:right="1440" w:bottom="1440" w:left="1440" w:header="708" w:footer="708" w:gutter="0"/>
@@ -277,6 +1068,7 @@
     <w:lsdException w:name="HTML Sample" w:semiHidden="1" w:unhideWhenUsed="1"/>
     <w:lsdException w:name="HTML Typewriter" w:semiHidden="1" w:unhideWhenUsed="1"/>
     <w:lsdException w:name="HTML Variable" w:semiHidden="1" w:unhideWhenUsed="1"/>
+    <w:lsdException w:name="Normal Table" w:semiHidden="1" w:unhideWhenUsed="1"/>
     <w:lsdException w:name="annotation subject" w:semiHidden="1" w:unhideWhenUsed="1"/>
     <w:lsdException w:name="No List" w:semiHidden="1" w:unhideWhenUsed="1"/>
     <w:lsdException w:name="Outline List 1" w:semiHidden="1" w:unhideWhenUsed="1"/>
@@ -323,8 +1115,10 @@
     <w:lsdException w:name="Table Subtle 2" w:semiHidden="1" w:unhideWhenUsed="1"/>
     <w:lsdException w:name="Table Web 1" w:semiHidden="1" w:unhideWhenUsed="1"/>
     <w:lsdException w:name="Table Web 2" w:semiHidden="1" w:unhideWhenUsed="1"/>
+    <w:lsdException w:name="Table Web 3" w:semiHidden="1" w:unhideWhenUsed="1"/>
     <w:lsdException w:name="Balloon Text" w:semiHidden="1" w:unhideWhenUsed="1"/>
     <w:lsdException w:name="Table Grid" w:uiPriority="39"/>
+    <w:lsdException w:name="Table Theme" w:semiHidden="1" w:unhideWhenUsed="1"/>
     <w:lsdException w:name="Placeholder Text" w:semiHidden="1"/>
     <w:lsdException w:name="No Spacing" w:uiPriority="1" w:qFormat="1"/>
     <w:lsdException w:name="Light Shading" w:uiPriority="60"/>

</xml_diff>

<commit_message>
Finished paragraph structure edinting for BHD for ligo chapter. Relegate some information to an appendix
</commit_message>
<xml_diff>
--- a/BHD for LIGO structure.docx
+++ b/BHD for LIGO structure.docx
@@ -85,13 +85,8 @@
       </w:r>
     </w:p>
     <w:p>
-      <w:proofErr w:type="gramStart"/>
-      <w:r>
-        <w:t>In order for</w:t>
-      </w:r>
-      <w:proofErr w:type="gramEnd"/>
-      <w:r>
-        <w:t xml:space="preserve"> BHD to be worthwhile, it must be at least as good as DC readout.</w:t>
+      <w:r>
+        <w:t>In order for BHD to be worthwhile, it must be at least as good as DC readout.</w:t>
       </w:r>
     </w:p>
     <w:p>
@@ -122,28 +117,12 @@
       </w:r>
       <w:proofErr w:type="spellEnd"/>
       <w:r>
-        <w:t xml:space="preserve"> signal is by the optomechanical coupling due to </w:t>
-      </w:r>
-      <w:proofErr w:type="gramStart"/>
-      <w:r>
-        <w:t>an the</w:t>
-      </w:r>
-      <w:proofErr w:type="gramEnd"/>
-      <w:r>
-        <w:t xml:space="preserve"> optical springs between the SRC and the arm cavity.</w:t>
-      </w:r>
-    </w:p>
-    <w:p>
-      <w:r>
-        <w:t>SRC length noise is currently too high for LIGO to meet the A+ requirements \href{</w:t>
-      </w:r>
-      <w:proofErr w:type="gramStart"/>
-      <w:r>
-        <w:t>https://alog.ligo-wa.caltech.edu/aLOG/index.php?callRep=55755}{</w:t>
-      </w:r>
-      <w:proofErr w:type="gramEnd"/>
-      <w:r>
-        <w:t>Shelia Dwyer post}.</w:t>
+        <w:t xml:space="preserve"> signal is by the optomechanical coupling due to an the optical springs between the SRC and the arm cavity.</w:t>
+      </w:r>
+    </w:p>
+    <w:p>
+      <w:r>
+        <w:t>SRC length noise is currently too high for LIGO to meet the A+ requirements \href{https://alog.ligo-wa.caltech.edu/aLOG/index.php?callRep=55755}{Shelia Dwyer post}.</w:t>
       </w:r>
     </w:p>
     <w:p>
@@ -179,28 +158,12 @@
     </w:p>
     <w:p>
       <w:r>
-        <w:t xml:space="preserve">A squeezed light field can be used to surpass the noise floor set by </w:t>
-      </w:r>
-      <w:proofErr w:type="gramStart"/>
-      <w:r>
-        <w:t>an</w:t>
-      </w:r>
-      <w:proofErr w:type="gramEnd"/>
-      <w:r>
-        <w:t xml:space="preserve"> squeezed state.</w:t>
-      </w:r>
-    </w:p>
-    <w:p>
-      <w:r>
-        <w:t>More advanced upgrades, e.g. see \</w:t>
-      </w:r>
-      <w:proofErr w:type="gramStart"/>
-      <w:r>
-        <w:t>cite{</w:t>
-      </w:r>
-      <w:proofErr w:type="gramEnd"/>
-      <w:r>
-        <w:t>Kimble2001}, could reduce quantum noise substantially, and they rely on the implementation of BHD.</w:t>
+        <w:t>A squeezed light field can be used to surpass the noise floor set by an squeezed state.</w:t>
+      </w:r>
+    </w:p>
+    <w:p>
+      <w:r>
+        <w:t>More advanced upgrades, e.g. see \cite{Kimble2001}, could reduce quantum noise substantially, and they rely on the implementation of BHD.</w:t>
       </w:r>
     </w:p>
     <w:p>
@@ -241,7 +204,7 @@
     </w:p>
     <w:p>
       <w:r>
-        <w:t>The relationship between the differential phase in the arms and the power in the signal beam was used to find a light noise curve</w:t>
+        <w:t>The relationship between the differential phase in the arms and the power in the signal beam was used to find a light noise curve for the beam exiting the SRM in A+</w:t>
       </w:r>
       <w:r>
         <w:t>.</w:t>
@@ -252,104 +215,85 @@
         <w:t>This light noise curve was then used to set the maximum allowable intensity fluctuations due to phase noise between the local oscillator and the signal beams.</w:t>
       </w:r>
     </w:p>
-    <w:p/>
+    <w:p>
+      <w:r>
+        <w:t>\subsection{</w:t>
+      </w:r>
+      <w:r>
+        <w:rPr>
+          <w:u w:val="single"/>
+        </w:rPr>
+        <w:t>Local Oscillator Path</w:t>
+      </w:r>
+      <w:r>
+        <w:t>}</w:t>
+      </w:r>
+    </w:p>
+    <w:p>
+      <w:r>
+        <w:t>Two options for the local oscillator path were considered: a beam picked off from the main beam splitters AR coating (BSAR) or the beam transmitted through PR2 \cite{Zhang2019} (POP).</w:t>
+      </w:r>
+    </w:p>
+    <w:p>
+      <w:r>
+        <w:t xml:space="preserve">The layout for the optics which combine the </w:t>
+      </w:r>
+      <w:proofErr w:type="spellStart"/>
+      <w:r>
+        <w:t>the</w:t>
+      </w:r>
+      <w:proofErr w:type="spellEnd"/>
+      <w:r>
+        <w:t xml:space="preserve"> LO and AS beam is shown in figure \ref{</w:t>
+      </w:r>
+      <w:proofErr w:type="spellStart"/>
+      <w:r>
+        <w:t>fig:bhdforligochaptersketchoflodelivery</w:t>
+      </w:r>
+      <w:proofErr w:type="spellEnd"/>
+      <w:r>
+        <w:t>}</w:t>
+      </w:r>
+    </w:p>
+    <w:p>
+      <w:r>
+        <w:t>\subsection{The Linear Response Function Between Differential Strain and Power at the AS Port}</w:t>
+      </w:r>
+    </w:p>
+    <w:p>
+      <w:r>
+        <w:t>The linear response function of the A+ detectors was obtained using \</w:t>
+      </w:r>
+      <w:proofErr w:type="spellStart"/>
+      <w:r>
+        <w:t>textsc</w:t>
+      </w:r>
+      <w:proofErr w:type="spellEnd"/>
+      <w:r>
+        <w:t>{Finesse}.</w:t>
+      </w:r>
+    </w:p>
     <w:p>
       <w:r>
         <w:t>\</w:t>
       </w:r>
-      <w:proofErr w:type="gramStart"/>
-      <w:r>
-        <w:t>subsection{</w:t>
-      </w:r>
-      <w:proofErr w:type="gramEnd"/>
-      <w:r>
-        <w:rPr>
-          <w:u w:val="single"/>
-        </w:rPr>
-        <w:t>Local Oscillator Path</w:t>
-      </w:r>
-      <w:r>
-        <w:t>}</w:t>
-      </w:r>
-    </w:p>
-    <w:p>
-      <w:r>
-        <w:t>Two options for the local oscillator path were considered: a beam picked off from the main beam splitters AR coating (BSAR) or the beam transmitted through PR2 \</w:t>
-      </w:r>
-      <w:proofErr w:type="gramStart"/>
-      <w:r>
-        <w:t>cite{</w:t>
-      </w:r>
-      <w:proofErr w:type="gramEnd"/>
-      <w:r>
-        <w:t>Zhang2019} (POP).</w:t>
-      </w:r>
-    </w:p>
-    <w:p>
-      <w:r>
-        <w:t xml:space="preserve">The layout for the optics which combine the </w:t>
-      </w:r>
-      <w:proofErr w:type="spellStart"/>
-      <w:r>
-        <w:t>the</w:t>
-      </w:r>
-      <w:proofErr w:type="spellEnd"/>
-      <w:r>
-        <w:t xml:space="preserve"> LO and AS beam is shown in figure \ref{</w:t>
-      </w:r>
-      <w:proofErr w:type="spellStart"/>
-      <w:proofErr w:type="gramStart"/>
-      <w:r>
-        <w:t>fig:bhdforligochaptersketchoflodelivery</w:t>
-      </w:r>
-      <w:proofErr w:type="spellEnd"/>
-      <w:proofErr w:type="gramEnd"/>
-      <w:r>
-        <w:t>}</w:t>
-      </w:r>
-    </w:p>
-    <w:p>
-      <w:r>
-        <w:t>\</w:t>
-      </w:r>
-      <w:proofErr w:type="gramStart"/>
-      <w:r>
-        <w:t>subsection{</w:t>
-      </w:r>
-      <w:proofErr w:type="gramEnd"/>
-      <w:r>
-        <w:t>The Linear Response Function Between Differential Strain and Power at the AS Port}</w:t>
-      </w:r>
-    </w:p>
-    <w:p>
-      <w:r>
-        <w:t>The linear response function of the A+ detectors was obtained using \</w:t>
-      </w:r>
-      <w:proofErr w:type="spellStart"/>
-      <w:proofErr w:type="gramStart"/>
+      <w:proofErr w:type="spellStart"/>
       <w:r>
         <w:t>textsc</w:t>
       </w:r>
       <w:proofErr w:type="spellEnd"/>
       <w:r>
-        <w:t>{</w:t>
-      </w:r>
-      <w:proofErr w:type="gramEnd"/>
-      <w:r>
-        <w:t>Finesse}.</w:t>
-      </w:r>
-    </w:p>
-    <w:p>
-      <w:r>
-        <w:t>\</w:t>
-      </w:r>
-      <w:proofErr w:type="gramStart"/>
-      <w:r>
-        <w:t>subsection{</w:t>
-      </w:r>
-      <w:proofErr w:type="gramEnd"/>
-      <w:r>
-        <w:t>Converting the Sensitivity Curve for A+ into the HRTS requirement}</w:t>
+        <w:t xml:space="preserve">{Finesse} allows one to measure linear response functions by applying a `swept sine' signal to a component, and demodulating the light at the frequency of the applied signal. </w:t>
+      </w:r>
+    </w:p>
+    <w:p>
+      <w:r>
+        <w:t>To get the linear response function between arm motion and AS power into units of $\frac{\rm{Power}}{\rm{Strain}}$ (or $\frac{\rm{W}}{\rm{h}}$), several factors of 2 are need including.</w:t>
+      </w:r>
+    </w:p>
+    <w:p>
+      <w:r>
+        <w:t>\subsection{Converting the Sensitivity Curve for A+ into the HRTS requirement}</w:t>
       </w:r>
     </w:p>
     <w:p>
@@ -383,36 +327,17 @@
     </w:p>
     <w:p>
       <w:r>
-        <w:t>The quantum mechanics of this problem have been included in the A+ sensitivity curve \cite{</w:t>
-      </w:r>
-      <w:proofErr w:type="spellStart"/>
-      <w:r>
-        <w:t>a+curve</w:t>
-      </w:r>
-      <w:proofErr w:type="spellEnd"/>
-      <w:r>
-        <w:t>}, therefore we can approach this with classical physics</w:t>
-      </w:r>
-    </w:p>
-    <w:p>
-      <w:r>
-        <w:t>The HRTS requirement assumes, based on the current design, that there will be 2 mirrors at 45\</w:t>
-      </w:r>
-      <w:proofErr w:type="spellStart"/>
-      <w:r>
-        <w:t>si</w:t>
-      </w:r>
-      <w:proofErr w:type="spellEnd"/>
-      <w:r>
-        <w:t>{\</w:t>
-      </w:r>
-      <w:proofErr w:type="gramStart"/>
-      <w:r>
-        <w:t>degree}  which</w:t>
-      </w:r>
-      <w:proofErr w:type="gramEnd"/>
-      <w:r>
-        <w:t xml:space="preserve"> are used to steer the AS and LO beams.</w:t>
+        <w:t>Next, a change in power measured in the combined LO/signal beam due to a phase modulation (i.e.\~path length modulation) in the LO or signal path needs calculating.</w:t>
+      </w:r>
+    </w:p>
+    <w:p>
+      <w:r>
+        <w:t>To determine the longitudinal motion requirement for the optics that combine the LO and signal beam the number of optics and a factor of ten safety margin need to be included.</w:t>
+      </w:r>
+    </w:p>
+    <w:p>
+      <w:r>
+        <w:t>To determine the amount of isolation required, a typical motion of the optical table needs to be compared to the longitudinal motion requirement for the optics.</w:t>
       </w:r>
     </w:p>
     <w:p>
@@ -420,40 +345,57 @@
         <w:rPr>
           <w:b/>
           <w:bCs/>
+          <w:u w:val="single"/>
         </w:rPr>
       </w:pPr>
       <w:r>
         <w:rPr>
           <w:b/>
           <w:bCs/>
+          <w:u w:val="single"/>
         </w:rPr>
         <w:t>Design of the HAM6 layout</w:t>
       </w:r>
     </w:p>
     <w:p>
       <w:r>
-        <w:t xml:space="preserve">Fundamentally, the layout in HAM6 must combine the AS beam and the LO </w:t>
-      </w:r>
-      <w:proofErr w:type="gramStart"/>
-      <w:r>
-        <w:t>beam, and</w:t>
-      </w:r>
-      <w:proofErr w:type="gramEnd"/>
-      <w:r>
-        <w:t xml:space="preserve"> sense the combined beams to form a balanced homodyne detector.</w:t>
-      </w:r>
-    </w:p>
-    <w:p>
-      <w:r>
-        <w:t>\</w:t>
-      </w:r>
-      <w:proofErr w:type="gramStart"/>
-      <w:r>
-        <w:t>subsection{</w:t>
-      </w:r>
-      <w:proofErr w:type="gramEnd"/>
-      <w:r>
-        <w:t>The Constraints and Requirements of the Layout of HAM6}</w:t>
+        <w:t>Fundamentally, the layout in HAM6 must combine the AS beam and the LO beam, and sense the combined beams to form a balanced homodyne detector.</w:t>
+      </w:r>
+    </w:p>
+    <w:p>
+      <w:r>
+        <w:t>\subsection{</w:t>
+      </w:r>
+      <w:r>
+        <w:t xml:space="preserve"> </w:t>
+      </w:r>
+      <w:r>
+        <w:t>The Constraints and Functionality of the Layout of HAM6</w:t>
+      </w:r>
+      <w:r>
+        <w:t>}</w:t>
+      </w:r>
+    </w:p>
+    <w:p>
+      <w:r>
+        <w:lastRenderedPageBreak/>
+        <w:t xml:space="preserve">This section will describe the functionality required from the </w:t>
+      </w:r>
+      <w:proofErr w:type="spellStart"/>
+      <w:r>
+        <w:t>the</w:t>
+      </w:r>
+      <w:proofErr w:type="spellEnd"/>
+      <w:r>
+        <w:t xml:space="preserve"> HAM6 layout, and some practical constraints that are imposed by the hardware and the infrastructure</w:t>
+      </w:r>
+      <w:r>
+        <w:t>.</w:t>
+      </w:r>
+    </w:p>
+    <w:p>
+      <w:r>
+        <w:t>As the constraints give a starting point for all designs, they will be discussed first.</w:t>
       </w:r>
     </w:p>
     <w:p>
@@ -463,29 +405,47 @@
     </w:p>
     <w:p>
       <w:r>
-        <w:t>The design beam parameter at the SRM is $q_{\</w:t>
-      </w:r>
-      <w:proofErr w:type="gramStart"/>
-      <w:r>
-        <w:t>rm{</w:t>
-      </w:r>
-      <w:proofErr w:type="gramEnd"/>
-      <w:r>
-        <w:t>SRM}} = -3.55 + 1.09i\,\rm{m} $, so the design of the HAM6 mode matching optics is based on this number.</w:t>
-      </w:r>
-    </w:p>
-    <w:p>
-      <w:r>
-        <w:lastRenderedPageBreak/>
-        <w:t xml:space="preserve">After BHDBS2, the layout the optics between OMC input couplers and BHDBS2 must provide the functionality for steering the combined AS and LO beam into the </w:t>
-      </w:r>
-      <w:proofErr w:type="gramStart"/>
-      <w:r>
-        <w:t>OMC, and</w:t>
-      </w:r>
-      <w:proofErr w:type="gramEnd"/>
-      <w:r>
-        <w:t xml:space="preserve"> provide mode matching for the AS beam to the OMC.</w:t>
+        <w:t>The design beam parameter at the SRM is $q_{\rm{SRM}} = -3.55 + 1.09i\,\rm{m} $, so the design of the HAM6 mode matching optics is based on this number.</w:t>
+      </w:r>
+    </w:p>
+    <w:p>
+      <w:r>
+        <w:t>The current OMC design (with trivial modifications) will be used to remove junk light from the signal beam, so ther</w:t>
+      </w:r>
+      <w:r>
+        <w:t>e</w:t>
+      </w:r>
+      <w:r>
+        <w:t xml:space="preserve"> is no choice in target waist size.</w:t>
+      </w:r>
+    </w:p>
+    <w:p>
+      <w:r>
+        <w:t xml:space="preserve">The requirements for the HAM6 layout </w:t>
+      </w:r>
+      <w:r>
+        <w:t>are</w:t>
+      </w:r>
+      <w:r>
+        <w:t xml:space="preserve"> to provide steering for the interferometer beam into the OMC, and mode matching between the interferometer beam and the OMC.</w:t>
+      </w:r>
+    </w:p>
+    <w:p>
+      <w:r>
+        <w:t xml:space="preserve">The goal for mode matching between the arm mode and the OMC mode is </w:t>
+      </w:r>
+      <w:proofErr w:type="spellStart"/>
+      <w:r>
+        <w:t>is</w:t>
+      </w:r>
+      <w:proofErr w:type="spellEnd"/>
+      <w:r>
+        <w:t xml:space="preserve"> $&gt;98\%$.</w:t>
+      </w:r>
+    </w:p>
+    <w:p>
+      <w:r>
+        <w:t>In principle, the role of the AWC in HAM6 is to correct for geometry errors of the optics after the SRM such that the mode matching between the Arm mode and the OMC waist is maximised.</w:t>
       </w:r>
     </w:p>
     <w:p>
@@ -503,15 +463,7 @@
       </w:r>
       <w:proofErr w:type="spellEnd"/>
       <w:r>
-        <w:t>{\</w:t>
-      </w:r>
-      <w:proofErr w:type="gramStart"/>
-      <w:r>
-        <w:t>degree}$</w:t>
-      </w:r>
-      <w:proofErr w:type="gramEnd"/>
-      <w:r>
-        <w:t xml:space="preserve"> of </w:t>
+        <w:t xml:space="preserve">{\degree}$ of </w:t>
       </w:r>
       <w:proofErr w:type="spellStart"/>
       <w:r>
@@ -537,21 +489,6 @@
     </w:p>
     <w:p>
       <w:r>
-        <w:t xml:space="preserve">The current OMC design (with trivial modifications) will be used to remove junk light from the signal beam, so </w:t>
-      </w:r>
-      <w:proofErr w:type="spellStart"/>
-      <w:proofErr w:type="gramStart"/>
-      <w:r>
-        <w:t>their</w:t>
-      </w:r>
-      <w:proofErr w:type="spellEnd"/>
-      <w:proofErr w:type="gramEnd"/>
-      <w:r>
-        <w:t xml:space="preserve"> is no choice in target waist size.</w:t>
-      </w:r>
-    </w:p>
-    <w:p>
-      <w:r>
         <w:t>The light transmitted by the OMCs is used to measure the gravitational wave signal, since the higher order modes are suppressed by a factor of the finesse of the OMC.</w:t>
       </w:r>
     </w:p>
@@ -562,199 +499,12 @@
     </w:p>
     <w:p>
       <w:r>
-        <w:t>\</w:t>
-      </w:r>
-      <w:proofErr w:type="gramStart"/>
-      <w:r>
-        <w:t>subsection{</w:t>
-      </w:r>
-      <w:proofErr w:type="gramEnd"/>
-      <w:r>
-        <w:t>Longitudinal Control}</w:t>
-      </w:r>
-    </w:p>
-    <w:p>
-      <w:r>
-        <w:t>Longitudinal control refers to the sensing and actuation of lengths within the interferometer, i.e.</w:t>
-      </w:r>
-      <w:proofErr w:type="gramStart"/>
-      <w:r>
-        <w:t>\,position</w:t>
-      </w:r>
-      <w:proofErr w:type="gramEnd"/>
-      <w:r>
-        <w:t xml:space="preserve"> of optics along the optical axis.</w:t>
-      </w:r>
-    </w:p>
-    <w:p>
-      <w:r>
-        <w:t>\</w:t>
-      </w:r>
-      <w:proofErr w:type="gramStart"/>
-      <w:r>
-        <w:t>subsubsection{</w:t>
-      </w:r>
-      <w:proofErr w:type="gramEnd"/>
-      <w:r>
-        <w:t>Homodyne Angle}</w:t>
-      </w:r>
-    </w:p>
-    <w:p>
-      <w:r>
-        <w:t>One method of controlling the homodyne angle is using the so called `RF 36` signal.</w:t>
-      </w:r>
-    </w:p>
-    <w:p>
-      <w:r>
-        <w:t>\</w:t>
-      </w:r>
-      <w:proofErr w:type="gramStart"/>
-      <w:r>
-        <w:t>subsubsection{</w:t>
-      </w:r>
-      <w:proofErr w:type="gramEnd"/>
-      <w:r>
-        <w:t>OMC Length}</w:t>
-      </w:r>
-    </w:p>
-    <w:p>
-      <w:r>
-        <w:t>Keeping the OMC length locked to the combined LO-AS beam can be done by actuating on the length of PZT mirrors in the OMC.</w:t>
-      </w:r>
-    </w:p>
-    <w:p>
-      <w:r>
-        <w:t>\</w:t>
-      </w:r>
-      <w:proofErr w:type="gramStart"/>
-      <w:r>
-        <w:t>subsubsection{</w:t>
-      </w:r>
-      <w:proofErr w:type="gramEnd"/>
-      <w:r>
-        <w:t>Squeezing Angle to Measurement Phase}</w:t>
-      </w:r>
-    </w:p>
-    <w:p>
-      <w:r>
-        <w:t xml:space="preserve">The squeezing and measurement phase may be controlled by measuring the </w:t>
-      </w:r>
-      <w:proofErr w:type="gramStart"/>
-      <w:r>
-        <w:t>3,MHz</w:t>
-      </w:r>
-      <w:proofErr w:type="gramEnd"/>
-      <w:r>
-        <w:t xml:space="preserve"> signal transmitted through the OMC.</w:t>
-      </w:r>
-    </w:p>
-    <w:p>
-      <w:r>
-        <w:t>\</w:t>
-      </w:r>
-      <w:proofErr w:type="gramStart"/>
-      <w:r>
-        <w:t>subsection{</w:t>
-      </w:r>
-      <w:proofErr w:type="gramEnd"/>
-      <w:r>
-        <w:t>Alignment Control}</w:t>
-      </w:r>
-    </w:p>
-    <w:p>
-      <w:r>
-        <w:t>The alignment of beams within the interferometer is required to maximise the power of the laser the mode containing the gravitational wave signal.</w:t>
-      </w:r>
-    </w:p>
-    <w:p>
-      <w:r>
-        <w:t>\</w:t>
-      </w:r>
-      <w:proofErr w:type="gramStart"/>
-      <w:r>
-        <w:t>subsubsection{</w:t>
-      </w:r>
-      <w:proofErr w:type="gramEnd"/>
-      <w:r>
-        <w:t>LO and AS alignment}</w:t>
-      </w:r>
-    </w:p>
-    <w:p>
-      <w:r>
-        <w:t>The alignment of the signal to the to the AS beam will be done with either OM0 or BHDM1, and BHDBS2.</w:t>
-      </w:r>
-    </w:p>
-    <w:p>
-      <w:r>
-        <w:t>\</w:t>
-      </w:r>
-      <w:proofErr w:type="gramStart"/>
-      <w:r>
-        <w:t>subsubsection{</w:t>
-      </w:r>
-      <w:proofErr w:type="gramEnd"/>
-      <w:r>
-        <w:t>Alignment of the LO-AS beam to the OMC}</w:t>
-      </w:r>
-    </w:p>
-    <w:p>
-      <w:r>
-        <w:t>A dither applied to a HRTS in either the LO or AS path will produce a signal in transmission through the OMC.</w:t>
-      </w:r>
-    </w:p>
-    <w:p>
-      <w:r>
-        <w:t>\</w:t>
-      </w:r>
-      <w:proofErr w:type="gramStart"/>
-      <w:r>
-        <w:t>subsubsection{</w:t>
-      </w:r>
-      <w:proofErr w:type="gramEnd"/>
-      <w:r>
-        <w:t>Squeezer to AS beam}</w:t>
-      </w:r>
-    </w:p>
-    <w:p>
-      <w:r>
-        <w:lastRenderedPageBreak/>
-        <w:t>The pick-off at OM0 will be used to align the squeezer beam to the AS beam.</w:t>
-      </w:r>
-    </w:p>
-    <w:p>
-      <w:r>
-        <w:t>\</w:t>
-      </w:r>
-      <w:proofErr w:type="gramStart"/>
-      <w:r>
-        <w:t>subsubsection{</w:t>
-      </w:r>
-      <w:proofErr w:type="gramEnd"/>
-      <w:r>
-        <w:t>Differential Hard Mode}</w:t>
-      </w:r>
-    </w:p>
-    <w:p>
-      <w:r>
-        <w:t>The differential hard mode arises due to radiation pressure effects in the arm cavities.</w:t>
-      </w:r>
-    </w:p>
-    <w:p>
-      <w:r>
-        <w:t>\</w:t>
-      </w:r>
-      <w:proofErr w:type="gramStart"/>
-      <w:r>
-        <w:t>subsection{</w:t>
-      </w:r>
-      <w:proofErr w:type="gramEnd"/>
-      <w:r>
-        <w:t>Chosen Layout}</w:t>
-      </w:r>
-    </w:p>
-    <w:p>
-      <w:r>
-        <w:t>Optically, there are many layouts which could have satisfied the above requirements and constraints.</w:t>
+        <w:t>\subsection{Chosen Layout}</w:t>
+      </w:r>
+    </w:p>
+    <w:p>
+      <w:r>
+        <w:t>The design that is being taken forward at the time of writing is known as the `pentagram', and is shown in figure \ref{fig:bhdforligochapterlayout5f}.</w:t>
       </w:r>
     </w:p>
     <w:p>
@@ -767,15 +517,7 @@
       </w:r>
       <w:proofErr w:type="spellEnd"/>
       <w:r>
-        <w:t>{\</w:t>
-      </w:r>
-      <w:proofErr w:type="gramStart"/>
-      <w:r>
-        <w:t>degree}$</w:t>
-      </w:r>
-      <w:proofErr w:type="gramEnd"/>
-      <w:r>
-        <w:t xml:space="preserve"> </w:t>
+        <w:t xml:space="preserve">{\degree}$ </w:t>
       </w:r>
       <w:proofErr w:type="spellStart"/>
       <w:r>
@@ -837,6 +579,12 @@
     </w:p>
     <w:p>
       <w:r>
+        <w:t>Two perfectly mode matched beams will have identical beam parameters.</w:t>
+      </w:r>
+    </w:p>
+    <w:p>
+      <w:r>
+        <w:lastRenderedPageBreak/>
         <w:t>A curved mirror can only change the curvature of a Gaussian beam, meaning that at the mirrors surface the beams before and after reflection must have the same size.</w:t>
       </w:r>
     </w:p>
@@ -847,6 +595,11 @@
     </w:p>
     <w:p>
       <w:r>
+        <w:t>There are two other ways that a beam parameter could be graphically represented.</w:t>
+      </w:r>
+    </w:p>
+    <w:p>
+      <w:r>
         <w:t>To demonstrate how orthogonal actuators can be represented in WS space, consider the two lenses with variable power separated by 45\</w:t>
       </w:r>
       <w:proofErr w:type="spellStart"/>
@@ -868,25 +621,22 @@
     </w:p>
     <w:p>
       <w:r>
-        <w:t>Two perfectly mode matched beams will have identical beam parameters.</w:t>
-      </w:r>
-    </w:p>
-    <w:p>
-      <w:r>
         <w:t>The mode matching requirement for LIGO is $&gt;98\%$.</w:t>
       </w:r>
     </w:p>
     <w:p>
       <w:r>
-        <w:t>The modes from the SRM that can be matched at to the target is shown in Figure \ref{</w:t>
-      </w:r>
-      <w:proofErr w:type="gramStart"/>
-      <w:r>
-        <w:t>fig:bhdforligochapterlayout</w:t>
-      </w:r>
-      <w:proofErr w:type="gramEnd"/>
-      <w:r>
-        <w:t>5fmodessrmomcmodematchingsuccess}.</w:t>
+        <w:t>To visualise the effectiveness of the actuation provided by the active elements of the HAM6 layout, the region of the WS from which the target mode matching space achieved was computed.</w:t>
+      </w:r>
+    </w:p>
+    <w:p>
+      <w:r>
+        <w:t>The modes from the SRM that can be matched at to the target is shown in Figure \ref{fig:bhdforligochapterlayout5fmodessrmomcmodematchingsuccess}.</w:t>
+      </w:r>
+    </w:p>
+    <w:p>
+      <w:r>
+        <w:t>For all candidate layouts analysed, there were no major difference in the amount of modes that could be mode matched.</w:t>
       </w:r>
     </w:p>
     <w:p>
@@ -895,16 +645,16 @@
       </w:r>
     </w:p>
     <w:p>
-      <w:r>
-        <w:t>\</w:t>
-      </w:r>
-      <w:proofErr w:type="gramStart"/>
-      <w:r>
-        <w:t>section{</w:t>
-      </w:r>
-      <w:proofErr w:type="gramEnd"/>
-      <w:r>
-        <w:t>Conclusion about BHD for A+}</w:t>
+      <w:pPr>
+        <w:rPr>
+          <w:u w:val="single"/>
+        </w:rPr>
+      </w:pPr>
+      <w:r>
+        <w:rPr>
+          <w:u w:val="single"/>
+        </w:rPr>
+        <w:t>Conclusion about BHD for A+</w:t>
       </w:r>
     </w:p>
     <w:p>
@@ -919,15 +669,7 @@
     </w:p>
     <w:p>
       <w:r>
-        <w:t>The functionality required from the BHD layout was discussed, and a proposed layout that satisfies these requirements is shown in figure \ref{</w:t>
-      </w:r>
-      <w:proofErr w:type="gramStart"/>
-      <w:r>
-        <w:t>fig:bhdforligochapterlayout</w:t>
-      </w:r>
-      <w:proofErr w:type="gramEnd"/>
-      <w:r>
-        <w:t>5f}.</w:t>
+        <w:t>The functionality required from the BHD layout was discussed, and a proposed layout that satisfies these requirements is shown in figure \ref{fig:bhdforligochapterlayout5f}.</w:t>
       </w:r>
     </w:p>
     <w:p>

</xml_diff>

<commit_message>
editted BHD chapter 1 up to the final stage of the calculation. The calculation needs checking
</commit_message>
<xml_diff>
--- a/BHD for LIGO structure.docx
+++ b/BHD for LIGO structure.docx
@@ -16,19 +16,366 @@
       </w:r>
     </w:p>
     <w:p>
+      <w:r>
+        <w:t>New Structure</w:t>
+      </w:r>
+    </w:p>
+    <w:p>
       <w:pPr>
         <w:rPr>
-          <w:b/>
-          <w:bCs/>
           <w:u w:val="single"/>
         </w:rPr>
       </w:pPr>
-      <w:r>
+    </w:p>
+    <w:p>
+      <w:r>
+        <w:t xml:space="preserve">A major change between </w:t>
+      </w:r>
+      <w:proofErr w:type="spellStart"/>
+      <w:r>
+        <w:t>aLIGO</w:t>
+      </w:r>
+      <w:proofErr w:type="spellEnd"/>
+      <w:r>
+        <w:t xml:space="preserve"> and LIGO A+ will be the replacement of DC readout (see Section 5.1.1) with balanced homodyne detection (BHD). </w:t>
+      </w:r>
+    </w:p>
+    <w:p>
+      <w:r>
+        <w:t xml:space="preserve">The motivations for implementing BHD into the LIGO detectors are described in Section 5.1. </w:t>
+      </w:r>
+    </w:p>
+    <w:p>
+      <w:pPr>
         <w:rPr>
           <w:b/>
           <w:bCs/>
           <w:u w:val="single"/>
         </w:rPr>
+      </w:pPr>
+      <w:r>
+        <w:rPr>
+          <w:b/>
+          <w:bCs/>
+        </w:rPr>
+        <w:t>5.1 What is Balanced Homodyne Detection?</w:t>
+      </w:r>
+    </w:p>
+    <w:p>
+      <w:r>
+        <w:t>BHD is a method of measuring the information encoded in any quadrature of a signal beam (see Section 2.5 and e.g</w:t>
+      </w:r>
+      <w:r>
+        <w:t>.</w:t>
+      </w:r>
+      <w:r>
+        <w:t xml:space="preserve"> [38, Section 2])</w:t>
+      </w:r>
+    </w:p>
+    <w:p>
+      <w:r>
+        <w:t xml:space="preserve">Without BHD, the LIGO detectors will not be able to reach the design sensitivity for A+. </w:t>
+      </w:r>
+    </w:p>
+    <w:p>
+      <w:pPr>
+        <w:rPr>
+          <w:b/>
+          <w:bCs/>
+        </w:rPr>
+      </w:pPr>
+      <w:r>
+        <w:rPr>
+          <w:b/>
+          <w:bCs/>
+        </w:rPr>
+        <w:t>5.1.1 Alternatives to BHD</w:t>
+      </w:r>
+    </w:p>
+    <w:p>
+      <w:r>
+        <w:t xml:space="preserve">The current detection scheme is known as DC readout [31]; this is a form of homodyne detection. </w:t>
+      </w:r>
+    </w:p>
+    <w:p>
+      <w:r>
+        <w:t xml:space="preserve">The first generation of detectors used heterodyne readout (e.g. [149]). </w:t>
+      </w:r>
+    </w:p>
+    <w:p>
+      <w:pPr>
+        <w:rPr>
+          <w:b/>
+          <w:bCs/>
+          <w:u w:val="single"/>
+        </w:rPr>
+      </w:pPr>
+      <w:r>
+        <w:rPr>
+          <w:b/>
+          <w:bCs/>
+        </w:rPr>
+        <w:t>5.1.2 Quantum Mechanical Description of BHD</w:t>
+      </w:r>
+    </w:p>
+    <w:p>
+      <w:r>
+        <w:t>To understand how BHD can be used to detect quantum states of light, it is useful to express mathematically light and interference in terms of quantum mechanics.</w:t>
+      </w:r>
+    </w:p>
+    <w:p>
+      <w:r>
+        <w:t xml:space="preserve">Consider the interference of a LO field, aˆ, and a signal field, ˆb, on a 50:50 </w:t>
+      </w:r>
+      <w:proofErr w:type="spellStart"/>
+      <w:r>
+        <w:t>beamsplitter</w:t>
+      </w:r>
+      <w:proofErr w:type="spellEnd"/>
+      <w:r>
+        <w:t>.</w:t>
+      </w:r>
+    </w:p>
+    <w:p>
+      <w:pPr>
+        <w:rPr>
+          <w:b/>
+          <w:bCs/>
+          <w:u w:val="single"/>
+        </w:rPr>
+      </w:pPr>
+      <w:r>
+        <w:rPr>
+          <w:b/>
+          <w:bCs/>
+        </w:rPr>
+        <w:t>5.1.3 Other Motivations for Implementing BHD in LIGO A+</w:t>
+      </w:r>
+    </w:p>
+    <w:p>
+      <w:r>
+        <w:t xml:space="preserve">Different gravitational wave sources carry their information in different frequency bands and the detector may be optimised to reflect this [50,70,151,152]. </w:t>
+      </w:r>
+    </w:p>
+    <w:p>
+      <w:r>
+        <w:t xml:space="preserve">More advanced upgrades (see Chapter 2.6 or [50]) could alter quantum noise </w:t>
+      </w:r>
+      <w:proofErr w:type="gramStart"/>
+      <w:r>
+        <w:t>substantially, and</w:t>
+      </w:r>
+      <w:proofErr w:type="gramEnd"/>
+      <w:r>
+        <w:t xml:space="preserve"> they rely on the implementation of BHD. </w:t>
+      </w:r>
+    </w:p>
+    <w:p>
+      <w:r>
+        <w:t xml:space="preserve">BHD has some benefits over DC readout relating to the reduction of the DC light </w:t>
+      </w:r>
+      <w:proofErr w:type="gramStart"/>
+      <w:r>
+        <w:t>emerging</w:t>
+      </w:r>
+      <w:proofErr w:type="gramEnd"/>
+      <w:r>
+        <w:t xml:space="preserve"> from the AS port [147]. </w:t>
+      </w:r>
+    </w:p>
+    <w:p>
+      <w:pPr>
+        <w:rPr>
+          <w:b/>
+          <w:bCs/>
+        </w:rPr>
+      </w:pPr>
+      <w:r>
+        <w:rPr>
+          <w:b/>
+          <w:bCs/>
+        </w:rPr>
+        <w:t>5.2 Local Oscillator Path Length Stability Requirement for A+</w:t>
+      </w:r>
+    </w:p>
+    <w:p>
+      <w:r>
+        <w:t xml:space="preserve">In this section, a semi-classical approach is used to derive the path length stability requirement for the local oscillator. </w:t>
+      </w:r>
+    </w:p>
+    <w:p>
+      <w:r>
+        <w:t xml:space="preserve">Phase noise arises due to phase fluctuations in the LO beam being indistinguishable from phase fluctuations in the signal beam. </w:t>
+      </w:r>
+    </w:p>
+    <w:p>
+      <w:r>
+        <w:t>This section is structured as follows:</w:t>
+      </w:r>
+      <w:r>
+        <w:t xml:space="preserve"> </w:t>
+      </w:r>
+      <w:r>
+        <w:t xml:space="preserve"> f</w:t>
+      </w:r>
+      <w:r>
+        <w:t xml:space="preserve">irst, the LO path will be described. </w:t>
+      </w:r>
+    </w:p>
+    <w:p>
+      <w:pPr>
+        <w:rPr>
+          <w:b/>
+          <w:bCs/>
+          <w:u w:val="single"/>
+        </w:rPr>
+      </w:pPr>
+      <w:r>
+        <w:rPr>
+          <w:b/>
+          <w:bCs/>
+        </w:rPr>
+        <w:t>5.2.1 Local Oscillator Path</w:t>
+      </w:r>
+    </w:p>
+    <w:p>
+      <w:pPr>
+        <w:rPr>
+          <w:u w:val="single"/>
+        </w:rPr>
+      </w:pPr>
+      <w:r>
+        <w:t xml:space="preserve">The beam path for the LO and signal beams up to the point of recombination is described in this section. </w:t>
+      </w:r>
+    </w:p>
+    <w:p>
+      <w:r>
+        <w:lastRenderedPageBreak/>
+        <w:t xml:space="preserve">The LO could have been derived from a separate laser, but to </w:t>
+      </w:r>
+      <w:proofErr w:type="gramStart"/>
+      <w:r>
+        <w:t>acquire</w:t>
+      </w:r>
+      <w:proofErr w:type="gramEnd"/>
+      <w:r>
+        <w:t xml:space="preserve"> laser light with low frequency and intensity noise the LO will be picked off from a point within the interferometer.</w:t>
+      </w:r>
+      <w:r>
+        <w:t xml:space="preserve"> </w:t>
+      </w:r>
+    </w:p>
+    <w:p>
+      <w:pPr>
+        <w:rPr>
+          <w:b/>
+          <w:bCs/>
+        </w:rPr>
+      </w:pPr>
+      <w:r>
+        <w:rPr>
+          <w:b/>
+          <w:bCs/>
+        </w:rPr>
+        <w:t>5.2.2 The Linear Response Function Between Differential Strain and Power at the AS Port</w:t>
+      </w:r>
+    </w:p>
+    <w:p>
+      <w:r>
+        <w:t>Since the core optics of the interferometer will not be changing in a way relevant to this calculation, the LLO Finesse model [158] was used to calculate the linear response function.</w:t>
+      </w:r>
+    </w:p>
+    <w:p>
+      <w:r>
+        <w:t>For this calculation, the linear response function needs to be converted into more convenient units.</w:t>
+      </w:r>
+    </w:p>
+    <w:p>
+      <w:pPr>
+        <w:rPr>
+          <w:b/>
+          <w:bCs/>
+        </w:rPr>
+      </w:pPr>
+      <w:r>
+        <w:rPr>
+          <w:b/>
+          <w:bCs/>
+        </w:rPr>
+        <w:t>5.2.3 Converting the Sensitivity Curve for A+ into a Longitudinal Motion Requirement</w:t>
+      </w:r>
+    </w:p>
+    <w:p>
+      <w:r>
+        <w:t xml:space="preserve">To convert the A+ sensitivity curve into a path length stability requirement for the LO, a few steps are </w:t>
+      </w:r>
+      <w:proofErr w:type="gramStart"/>
+      <w:r>
+        <w:t>required</w:t>
+      </w:r>
+      <w:proofErr w:type="gramEnd"/>
+      <w:r>
+        <w:t xml:space="preserve">. </w:t>
+      </w:r>
+    </w:p>
+    <w:p>
+      <w:r>
+        <w:t xml:space="preserve">The A+ sensitivity curve was multiplied by the function shown in 5.3 to convert it from units of √ h Hz to √ W </w:t>
+      </w:r>
+      <w:proofErr w:type="gramStart"/>
+      <w:r>
+        <w:t>Hz .</w:t>
+      </w:r>
+      <w:proofErr w:type="gramEnd"/>
+      <w:r>
+        <w:t xml:space="preserve"> </w:t>
+      </w:r>
+    </w:p>
+    <w:p>
+      <w:r>
+        <w:t>The next step is to calculate the change in power measured in the combined LO/signal beam due to a relative phase modulation between</w:t>
+      </w:r>
+      <w:r>
+        <w:t xml:space="preserve"> them.</w:t>
+      </w:r>
+    </w:p>
+    <w:p>
+      <w:r>
+        <w:t>The light noise curve shown in Figure 5.4 should be multiplied by λ 2π 1 2|EsE † sig| to obtain the noise floor of the interferometer in units of LO path length noise.</w:t>
+      </w:r>
+    </w:p>
+    <w:p/>
+    <w:p/>
+    <w:p/>
+    <w:p/>
+    <w:p/>
+    <w:p>
+      <w:pPr>
+        <w:rPr>
+          <w:u w:val="single"/>
+        </w:rPr>
+      </w:pPr>
+      <w:r>
+        <w:rPr>
+          <w:u w:val="single"/>
+        </w:rPr>
+        <w:t>OLD Structure</w:t>
+      </w:r>
+    </w:p>
+    <w:p>
+      <w:pPr>
+        <w:rPr>
+          <w:b/>
+          <w:bCs/>
+          <w:u w:val="single"/>
+        </w:rPr>
+      </w:pPr>
+      <w:r>
+        <w:rPr>
+          <w:b/>
+          <w:bCs/>
+          <w:u w:val="single"/>
+        </w:rPr>
         <w:t>Intro</w:t>
       </w:r>
     </w:p>
@@ -39,7 +386,15 @@
     </w:p>
     <w:p>
       <w:r>
-        <w:t>BHD is a method of measuring information encoded by a light field, and it forms a key part of many quantum optics experiments.</w:t>
+        <w:t xml:space="preserve">BHD is a method of measuring information encoded by a light field, and it forms a key part of </w:t>
+      </w:r>
+      <w:proofErr w:type="gramStart"/>
+      <w:r>
+        <w:t>many</w:t>
+      </w:r>
+      <w:proofErr w:type="gramEnd"/>
+      <w:r>
+        <w:t xml:space="preserve"> quantum optics experiments.</w:t>
       </w:r>
     </w:p>
     <w:p>
@@ -76,7 +431,15 @@
     </w:p>
     <w:p>
       <w:r>
-        <w:t>There are some advantages for BHD when it is compared to DC readout, although for A+ the quantifiable difference is hard to judge.</w:t>
+        <w:t xml:space="preserve">There are </w:t>
+      </w:r>
+      <w:proofErr w:type="gramStart"/>
+      <w:r>
+        <w:t>some</w:t>
+      </w:r>
+      <w:proofErr w:type="gramEnd"/>
+      <w:r>
+        <w:t xml:space="preserve"> advantages for BHD when it is compared to DC readout, although for A+ the quantifiable difference is hard to judge.</w:t>
       </w:r>
     </w:p>
     <w:p>
@@ -85,13 +448,27 @@
       </w:r>
     </w:p>
     <w:p>
-      <w:r>
-        <w:t>In order for BHD to be worthwhile, it must be at least as good as DC readout.</w:t>
-      </w:r>
-    </w:p>
-    <w:p>
-      <w:r>
-        <w:t>BHD has some practical benefits over DC readout as well as some interesting prospects in relation to the quantum noise limit of the detector</w:t>
+      <w:proofErr w:type="gramStart"/>
+      <w:r>
+        <w:t>In order for</w:t>
+      </w:r>
+      <w:proofErr w:type="gramEnd"/>
+      <w:r>
+        <w:t xml:space="preserve"> BHD to be worthwhile, it must be at least as good as DC readout.</w:t>
+      </w:r>
+    </w:p>
+    <w:p>
+      <w:r>
+        <w:lastRenderedPageBreak/>
+        <w:t xml:space="preserve">BHD has </w:t>
+      </w:r>
+      <w:proofErr w:type="gramStart"/>
+      <w:r>
+        <w:t>some</w:t>
+      </w:r>
+      <w:proofErr w:type="gramEnd"/>
+      <w:r>
+        <w:t xml:space="preserve"> practical benefits over DC readout as well as some interesting prospects in relation to the quantum noise limit of the detector</w:t>
       </w:r>
       <w:r>
         <w:t>.</w:t>
@@ -117,12 +494,28 @@
       </w:r>
       <w:proofErr w:type="spellEnd"/>
       <w:r>
-        <w:t xml:space="preserve"> signal is by the optomechanical coupling due to an the optical springs between the SRC and the arm cavity.</w:t>
-      </w:r>
-    </w:p>
-    <w:p>
-      <w:r>
-        <w:t>SRC length noise is currently too high for LIGO to meet the A+ requirements \href{https://alog.ligo-wa.caltech.edu/aLOG/index.php?callRep=55755}{Shelia Dwyer post}.</w:t>
+        <w:t xml:space="preserve"> signal is by the optomechanical coupling due to </w:t>
+      </w:r>
+      <w:proofErr w:type="gramStart"/>
+      <w:r>
+        <w:t>an the</w:t>
+      </w:r>
+      <w:proofErr w:type="gramEnd"/>
+      <w:r>
+        <w:t xml:space="preserve"> optical springs between the SRC and the arm cavity.</w:t>
+      </w:r>
+    </w:p>
+    <w:p>
+      <w:r>
+        <w:t>SRC length noise is currently too high for LIGO to meet the A+ requirements \href{</w:t>
+      </w:r>
+      <w:proofErr w:type="gramStart"/>
+      <w:r>
+        <w:t>https://alog.ligo-wa.caltech.edu/aLOG/index.php?callRep=55755}{</w:t>
+      </w:r>
+      <w:proofErr w:type="gramEnd"/>
+      <w:r>
+        <w:t>Shelia Dwyer post}.</w:t>
       </w:r>
     </w:p>
     <w:p>
@@ -158,12 +551,28 @@
     </w:p>
     <w:p>
       <w:r>
-        <w:t>A squeezed light field can be used to surpass the noise floor set by an squeezed state.</w:t>
-      </w:r>
-    </w:p>
-    <w:p>
-      <w:r>
-        <w:t>More advanced upgrades, e.g. see \cite{Kimble2001}, could reduce quantum noise substantially, and they rely on the implementation of BHD.</w:t>
+        <w:t xml:space="preserve">A squeezed light field can be used to surpass the noise floor set by </w:t>
+      </w:r>
+      <w:proofErr w:type="gramStart"/>
+      <w:r>
+        <w:t>an</w:t>
+      </w:r>
+      <w:proofErr w:type="gramEnd"/>
+      <w:r>
+        <w:t xml:space="preserve"> squeezed state.</w:t>
+      </w:r>
+    </w:p>
+    <w:p>
+      <w:r>
+        <w:t>More advanced upgrades, e.g. see \</w:t>
+      </w:r>
+      <w:proofErr w:type="gramStart"/>
+      <w:r>
+        <w:t>cite{</w:t>
+      </w:r>
+      <w:proofErr w:type="gramEnd"/>
+      <w:r>
+        <w:t>Kimble2001}, could reduce quantum noise substantially, and they rely on the implementation of BHD.</w:t>
       </w:r>
     </w:p>
     <w:p>
@@ -185,26 +594,317 @@
           <w:bCs/>
           <w:u w:val="single"/>
         </w:rPr>
+        <w:t>Local Oscillator Path Length Stability Requirement</w:t>
+      </w:r>
+    </w:p>
+    <w:p>
+      <w:r>
+        <w:t xml:space="preserve">This section will go through the steps </w:t>
+      </w:r>
+      <w:proofErr w:type="gramStart"/>
+      <w:r>
+        <w:t>required</w:t>
+      </w:r>
+      <w:proofErr w:type="gramEnd"/>
+      <w:r>
+        <w:t xml:space="preserve"> to derive the phase noise requirement for the beam path of the A+ LO.</w:t>
+      </w:r>
+    </w:p>
+    <w:p>
+      <w:r>
+        <w:t>Phase noise arises due to phase fluctuations in the LO beam being indistinguishable is phase fluctuations in the AS beam</w:t>
+      </w:r>
+      <w:r>
+        <w:t>.</w:t>
+      </w:r>
+    </w:p>
+    <w:p>
+      <w:r>
+        <w:t>The relationship between the differential phase in the arms and the power in the signal beam was used to find a light noise curve for the beam exiting the SRM in A+</w:t>
+      </w:r>
+      <w:r>
+        <w:t>.</w:t>
+      </w:r>
+    </w:p>
+    <w:p>
+      <w:r>
+        <w:t>This light noise curve was then used to set the maximum allowable intensity fluctuations due to phase noise between the local oscillator and the signal beams.</w:t>
+      </w:r>
+    </w:p>
+    <w:p>
+      <w:r>
+        <w:t>\</w:t>
+      </w:r>
+      <w:proofErr w:type="gramStart"/>
+      <w:r>
+        <w:t>subsection{</w:t>
+      </w:r>
+      <w:proofErr w:type="gramEnd"/>
+      <w:r>
+        <w:rPr>
+          <w:u w:val="single"/>
+        </w:rPr>
+        <w:t>Local Oscillator Path</w:t>
+      </w:r>
+      <w:r>
+        <w:t>}</w:t>
+      </w:r>
+    </w:p>
+    <w:p>
+      <w:r>
+        <w:t>Two options for the local oscillator path were considered: a beam picked off from the main beam splitters AR coating (BSAR) or the beam transmitted through PR2 \</w:t>
+      </w:r>
+      <w:proofErr w:type="gramStart"/>
+      <w:r>
+        <w:t>cite{</w:t>
+      </w:r>
+      <w:proofErr w:type="gramEnd"/>
+      <w:r>
+        <w:t>Zhang2019} (POP).</w:t>
+      </w:r>
+    </w:p>
+    <w:p>
+      <w:r>
+        <w:t xml:space="preserve">The layout for the optics which combine the </w:t>
+      </w:r>
+      <w:proofErr w:type="spellStart"/>
+      <w:r>
+        <w:t>the</w:t>
+      </w:r>
+      <w:proofErr w:type="spellEnd"/>
+      <w:r>
+        <w:t xml:space="preserve"> LO and AS beam is shown in figure \ref{</w:t>
+      </w:r>
+      <w:proofErr w:type="spellStart"/>
+      <w:proofErr w:type="gramStart"/>
+      <w:r>
+        <w:t>fig:bhdforligochaptersketchoflodelivery</w:t>
+      </w:r>
+      <w:proofErr w:type="spellEnd"/>
+      <w:proofErr w:type="gramEnd"/>
+      <w:r>
+        <w:t>}</w:t>
+      </w:r>
+    </w:p>
+    <w:p>
+      <w:r>
+        <w:t>\</w:t>
+      </w:r>
+      <w:proofErr w:type="gramStart"/>
+      <w:r>
+        <w:t>subsection{</w:t>
+      </w:r>
+      <w:proofErr w:type="gramEnd"/>
+      <w:r>
+        <w:t>The Linear Response Function Between Differential Strain and Power at the AS Port}</w:t>
+      </w:r>
+    </w:p>
+    <w:p>
+      <w:r>
         <w:lastRenderedPageBreak/>
-        <w:t>Local Oscillator Path Length Stability Requirement</w:t>
-      </w:r>
-    </w:p>
-    <w:p>
-      <w:r>
-        <w:t>This section will go through the steps required to derive the phase noise requirement for the beam path of the A+ LO.</w:t>
-      </w:r>
-    </w:p>
-    <w:p>
-      <w:r>
-        <w:t>Phase noise arises due to phase fluctuations in the LO beam being indistinguishable is phase fluctuations in the AS beam</w:t>
-      </w:r>
+        <w:t>The linear response function of the A+ detectors was obtained using \</w:t>
+      </w:r>
+      <w:proofErr w:type="spellStart"/>
+      <w:proofErr w:type="gramStart"/>
+      <w:r>
+        <w:t>textsc</w:t>
+      </w:r>
+      <w:proofErr w:type="spellEnd"/>
+      <w:r>
+        <w:t>{</w:t>
+      </w:r>
+      <w:proofErr w:type="gramEnd"/>
+      <w:r>
+        <w:t>Finesse}.</w:t>
+      </w:r>
+    </w:p>
+    <w:p>
+      <w:r>
+        <w:t>\</w:t>
+      </w:r>
+      <w:proofErr w:type="spellStart"/>
+      <w:proofErr w:type="gramStart"/>
+      <w:r>
+        <w:t>textsc</w:t>
+      </w:r>
+      <w:proofErr w:type="spellEnd"/>
+      <w:r>
+        <w:t>{</w:t>
+      </w:r>
+      <w:proofErr w:type="gramEnd"/>
+      <w:r>
+        <w:t xml:space="preserve">Finesse} allows one to measure linear response functions by applying a `swept sine' signal to a component, and demodulating the light at the frequency of the applied signal. </w:t>
+      </w:r>
+    </w:p>
+    <w:p>
+      <w:r>
+        <w:t>To get the linear response function between arm motion and AS power into units of $\frac{\</w:t>
+      </w:r>
+      <w:proofErr w:type="gramStart"/>
+      <w:r>
+        <w:t>rm{</w:t>
+      </w:r>
+      <w:proofErr w:type="gramEnd"/>
+      <w:r>
+        <w:t>Power}}{\rm{Strain}}$ (or $\frac{\rm{W}}{\rm{h}}$), several factors of 2 are need including.</w:t>
+      </w:r>
+    </w:p>
+    <w:p>
+      <w:r>
+        <w:t>\</w:t>
+      </w:r>
+      <w:proofErr w:type="gramStart"/>
+      <w:r>
+        <w:t>subsection{</w:t>
+      </w:r>
+      <w:proofErr w:type="gramEnd"/>
+      <w:r>
+        <w:t>Converting the Sensitivity Curve for A+ into the HRTS requirement}</w:t>
+      </w:r>
+    </w:p>
+    <w:p>
+      <w:r>
+        <w:t xml:space="preserve">To convert the A+ sensitivity curve into a path length stability requirement for the local oscillator, a few steps are </w:t>
+      </w:r>
+      <w:proofErr w:type="gramStart"/>
+      <w:r>
+        <w:t>required</w:t>
+      </w:r>
+      <w:proofErr w:type="gramEnd"/>
       <w:r>
         <w:t>.</w:t>
       </w:r>
     </w:p>
     <w:p>
       <w:r>
-        <w:t>The relationship between the differential phase in the arms and the power in the signal beam was used to find a light noise curve for the beam exiting the SRM in A+</w:t>
+        <w:t>The A+ sensitivity\cite{</w:t>
+      </w:r>
+      <w:proofErr w:type="spellStart"/>
+      <w:r>
+        <w:t>a+curve</w:t>
+      </w:r>
+      <w:proofErr w:type="spellEnd"/>
+      <w:r>
+        <w:t>} curve was multiplied by the function shown in \ref{</w:t>
+      </w:r>
+      <w:proofErr w:type="spellStart"/>
+      <w:proofErr w:type="gramStart"/>
+      <w:r>
+        <w:t>fig:bhdforligochapterdetectorrepsonse</w:t>
+      </w:r>
+      <w:proofErr w:type="spellEnd"/>
+      <w:proofErr w:type="gramEnd"/>
+      <w:r>
+        <w:t>} to convert it from units of $\frac{\rm{h}}{\sqrt{\rm{Hz}}}$ to $\frac{\rm{W}}{\sqrt{\rm{Hz}}}$</w:t>
+      </w:r>
+    </w:p>
+    <w:p>
+      <w:r>
+        <w:t>Next, a change in power measured in the combined LO/signal beam due to a phase modulation (</w:t>
+      </w:r>
+      <w:proofErr w:type="gramStart"/>
+      <w:r>
+        <w:t>i.e.</w:t>
+      </w:r>
+      <w:proofErr w:type="gramEnd"/>
+      <w:r>
+        <w:t>\~path length modulation) in the LO or signal path needs calculating.</w:t>
+      </w:r>
+    </w:p>
+    <w:p>
+      <w:r>
+        <w:t xml:space="preserve">To </w:t>
+      </w:r>
+      <w:proofErr w:type="gramStart"/>
+      <w:r>
+        <w:t>determine</w:t>
+      </w:r>
+      <w:proofErr w:type="gramEnd"/>
+      <w:r>
+        <w:t xml:space="preserve"> the longitudinal motion requirement for the optics that combine the LO and signal beam the number of optics and a factor of ten safety margin need to be included.</w:t>
+      </w:r>
+    </w:p>
+    <w:p>
+      <w:r>
+        <w:t xml:space="preserve">To </w:t>
+      </w:r>
+      <w:proofErr w:type="gramStart"/>
+      <w:r>
+        <w:t>determine</w:t>
+      </w:r>
+      <w:proofErr w:type="gramEnd"/>
+      <w:r>
+        <w:t xml:space="preserve"> the amount of isolation required, a typical motion of the optical table needs to be compared to the longitudinal motion requirement for the optics.</w:t>
+      </w:r>
+    </w:p>
+    <w:p>
+      <w:pPr>
+        <w:rPr>
+          <w:b/>
+          <w:bCs/>
+          <w:u w:val="single"/>
+        </w:rPr>
+      </w:pPr>
+      <w:r>
+        <w:rPr>
+          <w:b/>
+          <w:bCs/>
+          <w:u w:val="single"/>
+        </w:rPr>
+        <w:t>Design of the HAM6 layout</w:t>
+      </w:r>
+    </w:p>
+    <w:p>
+      <w:r>
+        <w:t xml:space="preserve">Fundamentally, the layout in HAM6 must combine the AS beam and the LO </w:t>
+      </w:r>
+      <w:proofErr w:type="gramStart"/>
+      <w:r>
+        <w:t>beam, and</w:t>
+      </w:r>
+      <w:proofErr w:type="gramEnd"/>
+      <w:r>
+        <w:t xml:space="preserve"> sense the combined beams to form a balanced homodyne detector.</w:t>
+      </w:r>
+    </w:p>
+    <w:p>
+      <w:r>
+        <w:t>\</w:t>
+      </w:r>
+      <w:proofErr w:type="gramStart"/>
+      <w:r>
+        <w:t>subsection{</w:t>
+      </w:r>
+      <w:r>
+        <w:t xml:space="preserve"> The</w:t>
+      </w:r>
+      <w:proofErr w:type="gramEnd"/>
+      <w:r>
+        <w:t xml:space="preserve"> Constraints and Functionality of the Layout of HAM6</w:t>
+      </w:r>
+      <w:r>
+        <w:t>}</w:t>
+      </w:r>
+    </w:p>
+    <w:p>
+      <w:r>
+        <w:t xml:space="preserve">This section will describe the functionality </w:t>
+      </w:r>
+      <w:proofErr w:type="gramStart"/>
+      <w:r>
+        <w:t>required</w:t>
+      </w:r>
+      <w:proofErr w:type="gramEnd"/>
+      <w:r>
+        <w:t xml:space="preserve"> from the </w:t>
+      </w:r>
+      <w:proofErr w:type="spellStart"/>
+      <w:r>
+        <w:t>the</w:t>
+      </w:r>
+      <w:proofErr w:type="spellEnd"/>
+      <w:r>
+        <w:t xml:space="preserve"> HAM6 layout, and some practical constraints that are imposed by the hardware and the infrastructure</w:t>
       </w:r>
       <w:r>
         <w:t>.</w:t>
@@ -212,448 +912,362 @@
     </w:p>
     <w:p>
       <w:r>
-        <w:t>This light noise curve was then used to set the maximum allowable intensity fluctuations due to phase noise between the local oscillator and the signal beams.</w:t>
-      </w:r>
-    </w:p>
-    <w:p>
-      <w:r>
-        <w:t>\subsection{</w:t>
-      </w:r>
-      <w:r>
+        <w:t>As the constraints give a starting point for all designs, they will be discussed first.</w:t>
+      </w:r>
+    </w:p>
+    <w:p>
+      <w:r>
+        <w:t xml:space="preserve">The entry point of the AS and LO beams in principle can be anywhere in HAM6, however in reality they are fixed due to the location of HAM6 with respect to the interferometer, due to the location of the septum windows between HAM5 and HAM6, and due to the </w:t>
+      </w:r>
+      <w:proofErr w:type="gramStart"/>
+      <w:r>
+        <w:t>many</w:t>
+      </w:r>
+      <w:proofErr w:type="gramEnd"/>
+      <w:r>
+        <w:t xml:space="preserve"> other components of the interferometer that these beams need to avoid.</w:t>
+      </w:r>
+    </w:p>
+    <w:p>
+      <w:r>
+        <w:t>The design beam parameter at the SRM is $q_{\</w:t>
+      </w:r>
+      <w:proofErr w:type="gramStart"/>
+      <w:r>
+        <w:t>rm{</w:t>
+      </w:r>
+      <w:proofErr w:type="gramEnd"/>
+      <w:r>
+        <w:t>SRM}} = -3.55 + 1.09i\,\rm{m} $, so the design of the HAM6 mode matching optics is based on this number.</w:t>
+      </w:r>
+    </w:p>
+    <w:p>
+      <w:r>
+        <w:t>The current OMC design (with trivial modifications) will be used to remove junk light from the signal beam, so ther</w:t>
+      </w:r>
+      <w:r>
+        <w:t>e</w:t>
+      </w:r>
+      <w:r>
+        <w:t xml:space="preserve"> is no choice in target waist size.</w:t>
+      </w:r>
+    </w:p>
+    <w:p>
+      <w:r>
+        <w:t xml:space="preserve">The requirements for the HAM6 layout </w:t>
+      </w:r>
+      <w:r>
+        <w:t>are</w:t>
+      </w:r>
+      <w:r>
+        <w:t xml:space="preserve"> to </w:t>
+      </w:r>
+      <w:proofErr w:type="gramStart"/>
+      <w:r>
+        <w:t>provide</w:t>
+      </w:r>
+      <w:proofErr w:type="gramEnd"/>
+      <w:r>
+        <w:t xml:space="preserve"> steering for the interferometer beam into the OMC, and mode matching between the interferometer beam and the OMC.</w:t>
+      </w:r>
+    </w:p>
+    <w:p>
+      <w:r>
+        <w:t xml:space="preserve">The goal for mode matching between the arm mode and the OMC mode is </w:t>
+      </w:r>
+      <w:proofErr w:type="spellStart"/>
+      <w:r>
+        <w:t>is</w:t>
+      </w:r>
+      <w:proofErr w:type="spellEnd"/>
+      <w:r>
+        <w:t xml:space="preserve"> $&gt;98\%$.</w:t>
+      </w:r>
+    </w:p>
+    <w:p>
+      <w:r>
+        <w:lastRenderedPageBreak/>
+        <w:t>In principle, the role of the AWC in HAM6 is to correct for geometry errors of the optics after the SRM such that the mode matching between the Arm mode and the OMC waist is maximised.</w:t>
+      </w:r>
+    </w:p>
+    <w:p>
+      <w:r>
+        <w:t xml:space="preserve">After the AS and LO beams are combined, double stage suspensions will guide the beam from BHDBS2 to the OMC. These suspensions </w:t>
+      </w:r>
+      <w:proofErr w:type="gramStart"/>
+      <w:r>
+        <w:t>provide</w:t>
+      </w:r>
+      <w:proofErr w:type="gramEnd"/>
+      <w:r>
+        <w:t xml:space="preserve"> active positioning control and active wave front control.</w:t>
+      </w:r>
+    </w:p>
+    <w:p>
+      <w:r>
+        <w:t>To provide orthogonal alignment control in each beam path after BHDBS2, two of the mirrors are required to be separated by $90\</w:t>
+      </w:r>
+      <w:proofErr w:type="spellStart"/>
+      <w:r>
+        <w:t>si</w:t>
+      </w:r>
+      <w:proofErr w:type="spellEnd"/>
+      <w:r>
+        <w:t>{\</w:t>
+      </w:r>
+      <w:proofErr w:type="gramStart"/>
+      <w:r>
+        <w:t>degree}$</w:t>
+      </w:r>
+      <w:proofErr w:type="gramEnd"/>
+      <w:r>
+        <w:t xml:space="preserve"> of </w:t>
+      </w:r>
+      <w:proofErr w:type="spellStart"/>
+      <w:r>
+        <w:t>Gouy</w:t>
+      </w:r>
+      <w:proofErr w:type="spellEnd"/>
+      <w:r>
+        <w:t xml:space="preserve"> phase.</w:t>
+      </w:r>
+    </w:p>
+    <w:p>
+      <w:r>
+        <w:t xml:space="preserve">The goal for mode matching between the arm mode and the OMC mode is </w:t>
+      </w:r>
+      <w:proofErr w:type="spellStart"/>
+      <w:r>
+        <w:t>is</w:t>
+      </w:r>
+      <w:proofErr w:type="spellEnd"/>
+      <w:r>
+        <w:t xml:space="preserve"> $&gt;98\%$.</w:t>
+      </w:r>
+    </w:p>
+    <w:p>
+      <w:r>
+        <w:t>The light transmitted by the OMCs is used to measure the gravitational wave signal, since the higher order modes are suppressed by a factor of the finesse of the OMC.</w:t>
+      </w:r>
+    </w:p>
+    <w:p>
+      <w:r>
+        <w:t>It was decided that the two beams after BHDBS2 would have the same path length to reduce the cost of the HAM6 optics. This may also improve the common-mode noise rejection ratio.</w:t>
+      </w:r>
+    </w:p>
+    <w:p>
+      <w:r>
+        <w:t>\</w:t>
+      </w:r>
+      <w:proofErr w:type="gramStart"/>
+      <w:r>
+        <w:t>subsection{</w:t>
+      </w:r>
+      <w:proofErr w:type="gramEnd"/>
+      <w:r>
+        <w:t>Chosen Layout}</w:t>
+      </w:r>
+    </w:p>
+    <w:p>
+      <w:r>
+        <w:t>The design that is being taken forward at the time of writing is known as the `pentagram', and is shown in figure \ref{</w:t>
+      </w:r>
+      <w:proofErr w:type="gramStart"/>
+      <w:r>
+        <w:t>fig:bhdforligochapterlayout</w:t>
+      </w:r>
+      <w:proofErr w:type="gramEnd"/>
+      <w:r>
+        <w:t>5f}.</w:t>
+      </w:r>
+    </w:p>
+    <w:p>
+      <w:r>
+        <w:t>The focal lengths of the OFI lens, OMx1 and OMx2 where optimised so that there was a close to $45\</w:t>
+      </w:r>
+      <w:proofErr w:type="spellStart"/>
+      <w:r>
+        <w:t>si</w:t>
+      </w:r>
+      <w:proofErr w:type="spellEnd"/>
+      <w:r>
+        <w:t>{\</w:t>
+      </w:r>
+      <w:proofErr w:type="gramStart"/>
+      <w:r>
+        <w:t>degree}$</w:t>
+      </w:r>
+      <w:proofErr w:type="gramEnd"/>
+      <w:r>
+        <w:t xml:space="preserve"> </w:t>
+      </w:r>
+      <w:proofErr w:type="spellStart"/>
+      <w:r>
+        <w:t>Gouy</w:t>
+      </w:r>
+      <w:proofErr w:type="spellEnd"/>
+      <w:r>
+        <w:t xml:space="preserve"> phase separation between OMx1 and OMx2 as </w:t>
+      </w:r>
+      <w:proofErr w:type="spellStart"/>
+      <w:r>
+        <w:t>possilbe</w:t>
+      </w:r>
+      <w:proofErr w:type="spellEnd"/>
+      <w:r>
+        <w:t>.</w:t>
+      </w:r>
+    </w:p>
+    <w:p>
+      <w:pPr>
+        <w:rPr>
+          <w:b/>
+          <w:bCs/>
+        </w:rPr>
+      </w:pPr>
+      <w:r>
+        <w:rPr>
+          <w:b/>
+          <w:bCs/>
+        </w:rPr>
+        <w:t xml:space="preserve">WS </w:t>
+      </w:r>
+      <w:proofErr w:type="spellStart"/>
+      <w:r>
+        <w:rPr>
+          <w:b/>
+          <w:bCs/>
+        </w:rPr>
+        <w:t>visulations</w:t>
+      </w:r>
+      <w:proofErr w:type="spellEnd"/>
+      <w:r>
+        <w:rPr>
+          <w:b/>
+          <w:bCs/>
+        </w:rPr>
+        <w:t xml:space="preserve"> for Analysing the Robustness of the HAM6 Layout to Mode-Mismatch</w:t>
+      </w:r>
+    </w:p>
+    <w:p>
+      <w:r>
+        <w:t>The mode-matching between two laser beam modes, or a laser mode and a cavity mode, describes how similar those two modes are.</w:t>
+      </w:r>
+    </w:p>
+    <w:p>
+      <w:r>
+        <w:t>Mode-matching is usually, to first approximation, thought of as a difference in beam waist size and beam size location.</w:t>
+      </w:r>
+    </w:p>
+    <w:p>
+      <w:r>
+        <w:t>Two perfectly mode matched beams will have identical beam parameters.</w:t>
+      </w:r>
+    </w:p>
+    <w:p>
+      <w:r>
+        <w:t>A curved mirror can only change the curvature of a Gaussian beam, meaning that at the mirrors surface the beams before and after reflection must have the same size.</w:t>
+      </w:r>
+    </w:p>
+    <w:p>
+      <w:r>
+        <w:t>To visualise how a mode is changed by an optical layout, beam parameters can be represented in a 'WS space'.</w:t>
+      </w:r>
+    </w:p>
+    <w:p>
+      <w:r>
+        <w:t>There are two other ways that a beam parameter could be graphically represented.</w:t>
+      </w:r>
+    </w:p>
+    <w:p>
+      <w:r>
+        <w:t xml:space="preserve">To </w:t>
+      </w:r>
+      <w:proofErr w:type="gramStart"/>
+      <w:r>
+        <w:t>demonstrate</w:t>
+      </w:r>
+      <w:proofErr w:type="gramEnd"/>
+      <w:r>
+        <w:t xml:space="preserve"> how orthogonal actuators can be represented in WS space, consider the two lenses with variable power separated by 45\</w:t>
+      </w:r>
+      <w:proofErr w:type="spellStart"/>
+      <w:r>
+        <w:t>si</w:t>
+      </w:r>
+      <w:proofErr w:type="spellEnd"/>
+      <w:r>
+        <w:t xml:space="preserve">{\degree} of </w:t>
+      </w:r>
+      <w:proofErr w:type="spellStart"/>
+      <w:r>
+        <w:t>Gouy</w:t>
+      </w:r>
+      <w:proofErr w:type="spellEnd"/>
+      <w:r>
+        <w:t xml:space="preserve"> phase.</w:t>
+      </w:r>
+    </w:p>
+    <w:p>
+      <w:r>
+        <w:t>The mode matching requirement for LIGO is $&gt;98\%$.</w:t>
+      </w:r>
+    </w:p>
+    <w:p>
+      <w:r>
+        <w:t>To visualise the effectiveness of the actuation provided by the active elements of the HAM6 layout, the region of the WS from which the target mode matching space achieved was computed.</w:t>
+      </w:r>
+    </w:p>
+    <w:p>
+      <w:r>
+        <w:t>The modes from the SRM that can be matched at to the target is shown in Figure \ref{</w:t>
+      </w:r>
+      <w:proofErr w:type="gramStart"/>
+      <w:r>
+        <w:t>fig:bhdforligochapterlayout</w:t>
+      </w:r>
+      <w:proofErr w:type="gramEnd"/>
+      <w:r>
+        <w:t>5fmodessrmomcmodematchingsuccess}.</w:t>
+      </w:r>
+    </w:p>
+    <w:p>
+      <w:r>
+        <w:t xml:space="preserve">For all candidate layouts analysed, there were no major difference in the </w:t>
+      </w:r>
+      <w:proofErr w:type="gramStart"/>
+      <w:r>
+        <w:t>amount</w:t>
+      </w:r>
+      <w:proofErr w:type="gramEnd"/>
+      <w:r>
+        <w:t xml:space="preserve"> of modes that could be mode matched.</w:t>
+      </w:r>
+    </w:p>
+    <w:p>
+      <w:r>
+        <w:lastRenderedPageBreak/>
+        <w:t>Nevertheless, Figure \ref{</w:t>
+      </w:r>
+      <w:proofErr w:type="gramStart"/>
+      <w:r>
+        <w:t>fig:bhdforligochapterlayout</w:t>
+      </w:r>
+      <w:proofErr w:type="gramEnd"/>
+      <w:r>
+        <w:t>5fmodessrmomcmodematchingsuccess} is encouraging since it shows that the actuation provided by the OMx1 and OMx2 is very forgiving, so much so that the strict definition of the role of AWC in HAM6 may be relaxed in order for operators to use the AWC here to correct for other errors in the geometry of LIGO.</w:t>
+      </w:r>
+    </w:p>
+    <w:p>
+      <w:pPr>
         <w:rPr>
           <w:u w:val="single"/>
         </w:rPr>
-        <w:t>Local Oscillator Path</w:t>
-      </w:r>
-      <w:r>
-        <w:t>}</w:t>
-      </w:r>
-    </w:p>
-    <w:p>
-      <w:r>
-        <w:t>Two options for the local oscillator path were considered: a beam picked off from the main beam splitters AR coating (BSAR) or the beam transmitted through PR2 \cite{Zhang2019} (POP).</w:t>
-      </w:r>
-    </w:p>
-    <w:p>
-      <w:r>
-        <w:t xml:space="preserve">The layout for the optics which combine the </w:t>
-      </w:r>
-      <w:proofErr w:type="spellStart"/>
-      <w:r>
-        <w:t>the</w:t>
-      </w:r>
-      <w:proofErr w:type="spellEnd"/>
-      <w:r>
-        <w:t xml:space="preserve"> LO and AS beam is shown in figure \ref{</w:t>
-      </w:r>
-      <w:proofErr w:type="spellStart"/>
-      <w:r>
-        <w:t>fig:bhdforligochaptersketchoflodelivery</w:t>
-      </w:r>
-      <w:proofErr w:type="spellEnd"/>
-      <w:r>
-        <w:t>}</w:t>
-      </w:r>
-    </w:p>
-    <w:p>
-      <w:r>
-        <w:t>\subsection{The Linear Response Function Between Differential Strain and Power at the AS Port}</w:t>
-      </w:r>
-    </w:p>
-    <w:p>
-      <w:r>
-        <w:t>The linear response function of the A+ detectors was obtained using \</w:t>
-      </w:r>
-      <w:proofErr w:type="spellStart"/>
-      <w:r>
-        <w:t>textsc</w:t>
-      </w:r>
-      <w:proofErr w:type="spellEnd"/>
-      <w:r>
-        <w:t>{Finesse}.</w:t>
-      </w:r>
-    </w:p>
-    <w:p>
-      <w:r>
-        <w:t>\</w:t>
-      </w:r>
-      <w:proofErr w:type="spellStart"/>
-      <w:r>
-        <w:t>textsc</w:t>
-      </w:r>
-      <w:proofErr w:type="spellEnd"/>
-      <w:r>
-        <w:t xml:space="preserve">{Finesse} allows one to measure linear response functions by applying a `swept sine' signal to a component, and demodulating the light at the frequency of the applied signal. </w:t>
-      </w:r>
-    </w:p>
-    <w:p>
-      <w:r>
-        <w:t>To get the linear response function between arm motion and AS power into units of $\frac{\rm{Power}}{\rm{Strain}}$ (or $\frac{\rm{W}}{\rm{h}}$), several factors of 2 are need including.</w:t>
-      </w:r>
-    </w:p>
-    <w:p>
-      <w:r>
-        <w:t>\subsection{Converting the Sensitivity Curve for A+ into the HRTS requirement}</w:t>
-      </w:r>
-    </w:p>
-    <w:p>
-      <w:r>
-        <w:t>To convert the A+ sensitivity curve into a path length stability requirement for the local oscillator, a few steps are required</w:t>
-      </w:r>
-      <w:r>
-        <w:t>.</w:t>
-      </w:r>
-    </w:p>
-    <w:p>
-      <w:r>
-        <w:t>The A+ sensitivity\cite{</w:t>
-      </w:r>
-      <w:proofErr w:type="spellStart"/>
-      <w:r>
-        <w:t>a+curve</w:t>
-      </w:r>
-      <w:proofErr w:type="spellEnd"/>
-      <w:r>
-        <w:t>} curve was multiplied by the function shown in \ref{</w:t>
-      </w:r>
-      <w:proofErr w:type="spellStart"/>
-      <w:r>
-        <w:t>fig:bhdforligochapterdetectorrepsonse</w:t>
-      </w:r>
-      <w:proofErr w:type="spellEnd"/>
-      <w:r>
-        <w:t>} to convert it from units of $\frac{\rm{h}}{\sqrt{\rm{Hz}}}$ to $\frac{\rm{W}}{\sqrt{\rm{Hz}}}$</w:t>
-      </w:r>
-    </w:p>
-    <w:p>
-      <w:r>
-        <w:t>Next, a change in power measured in the combined LO/signal beam due to a phase modulation (i.e.\~path length modulation) in the LO or signal path needs calculating.</w:t>
-      </w:r>
-    </w:p>
-    <w:p>
-      <w:r>
-        <w:t>To determine the longitudinal motion requirement for the optics that combine the LO and signal beam the number of optics and a factor of ten safety margin need to be included.</w:t>
-      </w:r>
-    </w:p>
-    <w:p>
-      <w:r>
-        <w:t>To determine the amount of isolation required, a typical motion of the optical table needs to be compared to the longitudinal motion requirement for the optics.</w:t>
-      </w:r>
-    </w:p>
-    <w:p>
-      <w:pPr>
-        <w:rPr>
-          <w:b/>
-          <w:bCs/>
+      </w:pPr>
+      <w:r>
+        <w:rPr>
           <w:u w:val="single"/>
         </w:rPr>
-      </w:pPr>
-      <w:r>
-        <w:rPr>
-          <w:b/>
-          <w:bCs/>
-          <w:u w:val="single"/>
-        </w:rPr>
-        <w:t>Design of the HAM6 layout</w:t>
-      </w:r>
-    </w:p>
-    <w:p>
-      <w:r>
-        <w:t>Fundamentally, the layout in HAM6 must combine the AS beam and the LO beam, and sense the combined beams to form a balanced homodyne detector.</w:t>
-      </w:r>
-    </w:p>
-    <w:p>
-      <w:r>
-        <w:t>\subsection{</w:t>
-      </w:r>
-      <w:r>
-        <w:t xml:space="preserve"> </w:t>
-      </w:r>
-      <w:r>
-        <w:t>The Constraints and Functionality of the Layout of HAM6</w:t>
-      </w:r>
-      <w:r>
-        <w:t>}</w:t>
-      </w:r>
-    </w:p>
-    <w:p>
-      <w:r>
-        <w:lastRenderedPageBreak/>
-        <w:t xml:space="preserve">This section will describe the functionality required from the </w:t>
-      </w:r>
-      <w:proofErr w:type="spellStart"/>
-      <w:r>
-        <w:t>the</w:t>
-      </w:r>
-      <w:proofErr w:type="spellEnd"/>
-      <w:r>
-        <w:t xml:space="preserve"> HAM6 layout, and some practical constraints that are imposed by the hardware and the infrastructure</w:t>
-      </w:r>
-      <w:r>
-        <w:t>.</w:t>
-      </w:r>
-    </w:p>
-    <w:p>
-      <w:r>
-        <w:t>As the constraints give a starting point for all designs, they will be discussed first.</w:t>
-      </w:r>
-    </w:p>
-    <w:p>
-      <w:r>
-        <w:t>The entry point of the AS and LO beams in principle can be anywhere in HAM6, however in reality they are fixed due to the location of HAM6 with respect to the interferometer, due to the location of the septum windows between HAM5 and HAM6, and due to the many other components of the interferometer that these beams need to avoid.</w:t>
-      </w:r>
-    </w:p>
-    <w:p>
-      <w:r>
-        <w:t>The design beam parameter at the SRM is $q_{\rm{SRM}} = -3.55 + 1.09i\,\rm{m} $, so the design of the HAM6 mode matching optics is based on this number.</w:t>
-      </w:r>
-    </w:p>
-    <w:p>
-      <w:r>
-        <w:t>The current OMC design (with trivial modifications) will be used to remove junk light from the signal beam, so ther</w:t>
-      </w:r>
-      <w:r>
-        <w:t>e</w:t>
-      </w:r>
-      <w:r>
-        <w:t xml:space="preserve"> is no choice in target waist size.</w:t>
-      </w:r>
-    </w:p>
-    <w:p>
-      <w:r>
-        <w:t xml:space="preserve">The requirements for the HAM6 layout </w:t>
-      </w:r>
-      <w:r>
-        <w:t>are</w:t>
-      </w:r>
-      <w:r>
-        <w:t xml:space="preserve"> to provide steering for the interferometer beam into the OMC, and mode matching between the interferometer beam and the OMC.</w:t>
-      </w:r>
-    </w:p>
-    <w:p>
-      <w:r>
-        <w:t xml:space="preserve">The goal for mode matching between the arm mode and the OMC mode is </w:t>
-      </w:r>
-      <w:proofErr w:type="spellStart"/>
-      <w:r>
-        <w:t>is</w:t>
-      </w:r>
-      <w:proofErr w:type="spellEnd"/>
-      <w:r>
-        <w:t xml:space="preserve"> $&gt;98\%$.</w:t>
-      </w:r>
-    </w:p>
-    <w:p>
-      <w:r>
-        <w:t>In principle, the role of the AWC in HAM6 is to correct for geometry errors of the optics after the SRM such that the mode matching between the Arm mode and the OMC waist is maximised.</w:t>
-      </w:r>
-    </w:p>
-    <w:p>
-      <w:r>
-        <w:t>After the AS and LO beams are combined, double stage suspensions will guide the beam from BHDBS2 to the OMC. These suspensions provide active positioning control and active wave front control.</w:t>
-      </w:r>
-    </w:p>
-    <w:p>
-      <w:r>
-        <w:t>To provide orthogonal alignment control in each beam path after BHDBS2, two of the mirrors are required to be separated by $90\</w:t>
-      </w:r>
-      <w:proofErr w:type="spellStart"/>
-      <w:r>
-        <w:t>si</w:t>
-      </w:r>
-      <w:proofErr w:type="spellEnd"/>
-      <w:r>
-        <w:t xml:space="preserve">{\degree}$ of </w:t>
-      </w:r>
-      <w:proofErr w:type="spellStart"/>
-      <w:r>
-        <w:t>Gouy</w:t>
-      </w:r>
-      <w:proofErr w:type="spellEnd"/>
-      <w:r>
-        <w:t xml:space="preserve"> phase.</w:t>
-      </w:r>
-    </w:p>
-    <w:p>
-      <w:r>
-        <w:t xml:space="preserve">The goal for mode matching between the arm mode and the OMC mode is </w:t>
-      </w:r>
-      <w:proofErr w:type="spellStart"/>
-      <w:r>
-        <w:t>is</w:t>
-      </w:r>
-      <w:proofErr w:type="spellEnd"/>
-      <w:r>
-        <w:t xml:space="preserve"> $&gt;98\%$.</w:t>
-      </w:r>
-    </w:p>
-    <w:p>
-      <w:r>
-        <w:t>The light transmitted by the OMCs is used to measure the gravitational wave signal, since the higher order modes are suppressed by a factor of the finesse of the OMC.</w:t>
-      </w:r>
-    </w:p>
-    <w:p>
-      <w:r>
-        <w:t>It was decided that the two beams after BHDBS2 would have the same path length to reduce the cost of the HAM6 optics. This may also improve the common-mode noise rejection ratio.</w:t>
-      </w:r>
-    </w:p>
-    <w:p>
-      <w:r>
-        <w:t>\subsection{Chosen Layout}</w:t>
-      </w:r>
-    </w:p>
-    <w:p>
-      <w:r>
-        <w:t>The design that is being taken forward at the time of writing is known as the `pentagram', and is shown in figure \ref{fig:bhdforligochapterlayout5f}.</w:t>
-      </w:r>
-    </w:p>
-    <w:p>
-      <w:r>
-        <w:t>The focal lengths of the OFI lens, OMx1 and OMx2 where optimised so that there was a close to $45\</w:t>
-      </w:r>
-      <w:proofErr w:type="spellStart"/>
-      <w:r>
-        <w:t>si</w:t>
-      </w:r>
-      <w:proofErr w:type="spellEnd"/>
-      <w:r>
-        <w:t xml:space="preserve">{\degree}$ </w:t>
-      </w:r>
-      <w:proofErr w:type="spellStart"/>
-      <w:r>
-        <w:t>Gouy</w:t>
-      </w:r>
-      <w:proofErr w:type="spellEnd"/>
-      <w:r>
-        <w:t xml:space="preserve"> phase separation between OMx1 and OMx2 as </w:t>
-      </w:r>
-      <w:proofErr w:type="spellStart"/>
-      <w:r>
-        <w:t>possilbe</w:t>
-      </w:r>
-      <w:proofErr w:type="spellEnd"/>
-      <w:r>
-        <w:t>.</w:t>
-      </w:r>
-    </w:p>
-    <w:p>
-      <w:pPr>
-        <w:rPr>
-          <w:b/>
-          <w:bCs/>
-        </w:rPr>
-      </w:pPr>
-      <w:r>
-        <w:rPr>
-          <w:b/>
-          <w:bCs/>
-        </w:rPr>
-        <w:t xml:space="preserve">WS </w:t>
-      </w:r>
-      <w:proofErr w:type="spellStart"/>
-      <w:r>
-        <w:rPr>
-          <w:b/>
-          <w:bCs/>
-        </w:rPr>
-        <w:t>visulations</w:t>
-      </w:r>
-      <w:proofErr w:type="spellEnd"/>
-      <w:r>
-        <w:rPr>
-          <w:b/>
-          <w:bCs/>
-        </w:rPr>
-        <w:t xml:space="preserve"> for Analysing the Robustness of the HAM6 Layout to Mode-Mismatch</w:t>
-      </w:r>
-    </w:p>
-    <w:p>
-      <w:r>
-        <w:t>The mode-matching between two laser beam modes, or a laser mode and a cavity mode, describes how similar those two modes are.</w:t>
-      </w:r>
-    </w:p>
-    <w:p>
-      <w:r>
-        <w:t>Mode-matching is usually, to first approximation, thought of as a difference in beam waist size and beam size location.</w:t>
-      </w:r>
-    </w:p>
-    <w:p>
-      <w:r>
-        <w:t>Two perfectly mode matched beams will have identical beam parameters.</w:t>
-      </w:r>
-    </w:p>
-    <w:p>
-      <w:r>
-        <w:lastRenderedPageBreak/>
-        <w:t>A curved mirror can only change the curvature of a Gaussian beam, meaning that at the mirrors surface the beams before and after reflection must have the same size.</w:t>
-      </w:r>
-    </w:p>
-    <w:p>
-      <w:r>
-        <w:t>To visualise how a mode is changed by an optical layout, beam parameters can be represented in a 'WS space'.</w:t>
-      </w:r>
-    </w:p>
-    <w:p>
-      <w:r>
-        <w:t>There are two other ways that a beam parameter could be graphically represented.</w:t>
-      </w:r>
-    </w:p>
-    <w:p>
-      <w:r>
-        <w:t>To demonstrate how orthogonal actuators can be represented in WS space, consider the two lenses with variable power separated by 45\</w:t>
-      </w:r>
-      <w:proofErr w:type="spellStart"/>
-      <w:r>
-        <w:t>si</w:t>
-      </w:r>
-      <w:proofErr w:type="spellEnd"/>
-      <w:r>
-        <w:t xml:space="preserve">{\degree} of </w:t>
-      </w:r>
-      <w:proofErr w:type="spellStart"/>
-      <w:r>
-        <w:t>Gouy</w:t>
-      </w:r>
-      <w:proofErr w:type="spellEnd"/>
-      <w:r>
-        <w:t xml:space="preserve"> phase.</w:t>
-      </w:r>
-    </w:p>
-    <w:p>
-      <w:r>
-        <w:t>The mode matching requirement for LIGO is $&gt;98\%$.</w:t>
-      </w:r>
-    </w:p>
-    <w:p>
-      <w:r>
-        <w:t>To visualise the effectiveness of the actuation provided by the active elements of the HAM6 layout, the region of the WS from which the target mode matching space achieved was computed.</w:t>
-      </w:r>
-    </w:p>
-    <w:p>
-      <w:r>
-        <w:t>The modes from the SRM that can be matched at to the target is shown in Figure \ref{fig:bhdforligochapterlayout5fmodessrmomcmodematchingsuccess}.</w:t>
-      </w:r>
-    </w:p>
-    <w:p>
-      <w:r>
-        <w:t>For all candidate layouts analysed, there were no major difference in the amount of modes that could be mode matched.</w:t>
-      </w:r>
-    </w:p>
-    <w:p>
-      <w:r>
-        <w:t>Nevertheless, Figure \ref{fig:bhdforligochapterlayout5fmodessrmomcmodematchingsuccess} is encouraging since it shows that the actuation provided by the OMx1 and OMx2 is very forgiving, so much so that the strict definition of the role of AWC in HAM6 may be relaxed in order for operators to use the AWC here to correct for other errors in the geometry of LIGO.</w:t>
-      </w:r>
-    </w:p>
-    <w:p>
-      <w:pPr>
-        <w:rPr>
-          <w:u w:val="single"/>
-        </w:rPr>
-      </w:pPr>
-      <w:r>
-        <w:rPr>
-          <w:u w:val="single"/>
-        </w:rPr>
         <w:t>Conclusion about BHD for A+</w:t>
       </w:r>
     </w:p>
@@ -664,12 +1278,28 @@
     </w:p>
     <w:p>
       <w:r>
-        <w:t>BHD presents some technical challenges over DC readout.</w:t>
-      </w:r>
-    </w:p>
-    <w:p>
-      <w:r>
-        <w:t>The functionality required from the BHD layout was discussed, and a proposed layout that satisfies these requirements is shown in figure \ref{fig:bhdforligochapterlayout5f}.</w:t>
+        <w:t xml:space="preserve">BHD presents </w:t>
+      </w:r>
+      <w:proofErr w:type="gramStart"/>
+      <w:r>
+        <w:t>some</w:t>
+      </w:r>
+      <w:proofErr w:type="gramEnd"/>
+      <w:r>
+        <w:t xml:space="preserve"> technical challenges over DC readout.</w:t>
+      </w:r>
+    </w:p>
+    <w:p>
+      <w:r>
+        <w:t>The functionality required from the BHD layout was discussed, and a proposed layout that satisfies these requirements is shown in figure \ref{</w:t>
+      </w:r>
+      <w:proofErr w:type="gramStart"/>
+      <w:r>
+        <w:t>fig:bhdforligochapterlayout</w:t>
+      </w:r>
+      <w:proofErr w:type="gramEnd"/>
+      <w:r>
+        <w:t>5f}.</w:t>
       </w:r>
     </w:p>
     <w:p>
@@ -677,6 +1307,16 @@
         <w:t>By plotting the $&lt;98\%$ mode matching requirement in WS space, the robustness to changes in the input beam parameter was investigated.</w:t>
       </w:r>
     </w:p>
+    <w:p/>
+    <w:p/>
+    <w:p/>
+    <w:p/>
+    <w:p/>
+    <w:p/>
+    <w:p/>
+    <w:p/>
+    <w:p/>
+    <w:p/>
     <w:sectPr>
       <w:pgSz w:w="11906" w:h="16838"/>
       <w:pgMar w:top="1440" w:right="1440" w:bottom="1440" w:left="1440" w:header="708" w:footer="708" w:gutter="0"/>

</xml_diff>